<commit_message>
Updated docs, Firebase README, scripts, seed data, and added student info + committee files
</commit_message>
<xml_diff>
--- a/documentation.docx
+++ b/documentation.docx
@@ -106,7 +106,7 @@
         <w:t xml:space="preserve">Version:</w:t>
       </w:r>
       <w:r>
-        <w:t xml:space="preserve">  1.0</w:t>
+        <w:t xml:space="preserve">  2.0</w:t>
       </w:r>
     </w:p>
     <w:p>
@@ -122,7 +122,7 @@
         <w:t xml:space="preserve">Date:</w:t>
       </w:r>
       <w:r>
-        <w:t xml:space="preserve">  August 10, 2026</w:t>
+        <w:t xml:space="preserve">  August 15, 2026</w:t>
       </w:r>
     </w:p>
     <w:p>
@@ -351,6 +351,68 @@
           </w:p>
         </w:tc>
       </w:tr>
+      <w:tr>
+        <w:tc>
+          <w:tcPr>
+            <w:tcW w:w="2257" w:type="dxa"/>
+            <w:shd w:val="clear" w:color="auto" w:fill="F5F7FB"/>
+            <w:vAlign w:val="center"/>
+          </w:tcPr>
+          <w:p>
+            <w:pPr>
+              <w:spacing w:after="0" w:line="260" w:lineRule="auto"/>
+            </w:pPr>
+            <w:r>
+              <w:t xml:space="preserve">2.0</w:t>
+            </w:r>
+          </w:p>
+        </w:tc>
+        <w:tc>
+          <w:tcPr>
+            <w:tcW w:w="2257" w:type="dxa"/>
+            <w:shd w:val="clear" w:color="auto" w:fill="F5F7FB"/>
+            <w:vAlign w:val="center"/>
+          </w:tcPr>
+          <w:p>
+            <w:pPr>
+              <w:spacing w:after="0" w:line="260" w:lineRule="auto"/>
+            </w:pPr>
+            <w:r>
+              <w:t xml:space="preserve">15 Aug 2026</w:t>
+            </w:r>
+          </w:p>
+        </w:tc>
+        <w:tc>
+          <w:tcPr>
+            <w:tcW w:w="2257" w:type="dxa"/>
+            <w:shd w:val="clear" w:color="auto" w:fill="F5F7FB"/>
+            <w:vAlign w:val="center"/>
+          </w:tcPr>
+          <w:p>
+            <w:pPr>
+              <w:spacing w:after="0" w:line="260" w:lineRule="auto"/>
+            </w:pPr>
+            <w:r>
+              <w:t xml:space="preserve">NITER Clubs Portal team</w:t>
+            </w:r>
+          </w:p>
+        </w:tc>
+        <w:tc>
+          <w:tcPr>
+            <w:tcW w:w="2257" w:type="dxa"/>
+            <w:shd w:val="clear" w:color="auto" w:fill="F5F7FB"/>
+            <w:vAlign w:val="center"/>
+          </w:tcPr>
+          <w:p>
+            <w:pPr>
+              <w:spacing w:after="0" w:line="260" w:lineRule="auto"/>
+            </w:pPr>
+            <w:r>
+              <w:t xml:space="preserve">Added club ads, events, memberships, committee editor, student directory and Appwrite mirroring.</w:t>
+            </w:r>
+          </w:p>
+        </w:tc>
+      </w:tr>
     </w:tbl>
     <w:p>
       <w:pPr>
@@ -504,6 +566,53 @@
           </w:p>
         </w:tc>
       </w:tr>
+      <w:tr>
+        <w:tc>
+          <w:tcPr>
+            <w:tcW w:w="3009" w:type="dxa"/>
+            <w:shd w:val="clear" w:color="auto" w:fill="F5F7FB"/>
+            <w:vAlign w:val="center"/>
+          </w:tcPr>
+          <w:p>
+            <w:pPr>
+              <w:spacing w:after="0" w:line="260" w:lineRule="auto"/>
+            </w:pPr>
+            <w:r>
+              <w:t xml:space="preserve">2.0</w:t>
+            </w:r>
+          </w:p>
+        </w:tc>
+        <w:tc>
+          <w:tcPr>
+            <w:tcW w:w="3009" w:type="dxa"/>
+            <w:shd w:val="clear" w:color="auto" w:fill="F5F7FB"/>
+            <w:vAlign w:val="center"/>
+          </w:tcPr>
+          <w:p>
+            <w:pPr>
+              <w:spacing w:after="0" w:line="260" w:lineRule="auto"/>
+            </w:pPr>
+            <w:r>
+              <w:t xml:space="preserve">15 Aug 2026</w:t>
+            </w:r>
+          </w:p>
+        </w:tc>
+        <w:tc>
+          <w:tcPr>
+            <w:tcW w:w="3009" w:type="dxa"/>
+            <w:shd w:val="clear" w:color="auto" w:fill="F5F7FB"/>
+            <w:vAlign w:val="center"/>
+          </w:tcPr>
+          <w:p>
+            <w:pPr>
+              <w:spacing w:after="0" w:line="260" w:lineRule="auto"/>
+            </w:pPr>
+            <w:r>
+              <w:t xml:space="preserve">Documented the moderator-published ads feature, club events, membership approvals, the committee editor with email notifications, the admin-only student directory and the Appwrite mirroring routes.</w:t>
+            </w:r>
+          </w:p>
+        </w:tc>
+      </w:tr>
     </w:tbl>
     <w:p>
       <w:pPr>
@@ -1016,7 +1125,7 @@
         <w:t xml:space="preserve">•  </w:t>
       </w:r>
       <w:r>
-        <w:t xml:space="preserve">Let club executives publish an event or notice in under five minutes without touching code.</w:t>
+        <w:t xml:space="preserve">Let club executives publish an event, notice or sponsored ad in under five minutes without touching code.</w:t>
       </w:r>
     </w:p>
     <w:p>
@@ -1183,7 +1292,7 @@
               <w:spacing w:after="0" w:line="260" w:lineRule="auto"/>
             </w:pPr>
             <w:r>
-              <w:t xml:space="preserve">Single-file HTML/CSS/JavaScript SPA. Zero build step — opens directly in a browser and talks to Firebase in-browser.</w:t>
+              <w:t xml:space="preserve">Single-file HTML/CSS/JavaScript SPA. Zero build step — opens directly in a browser, talks to Firebase in-browser and mirrors submissions/accounts to Appwrite via optional API routes.</w:t>
             </w:r>
           </w:p>
         </w:tc>
@@ -1960,7 +2069,7 @@
               <w:spacing w:after="0" w:line="260" w:lineRule="auto"/>
             </w:pPr>
             <w:r>
-              <w:t xml:space="preserve">Hero with live clock and next deadline, live stat chips (clubs, open forms, submissions, reactions), clubs grid, forms open now with countdowns, realtime activity feed, latest notices, student tools.</w:t>
+              <w:t xml:space="preserve">Hero with live clock and next deadline, live stat chips (clubs, open forms, submissions, reactions), sponsored ads carousel (§4.7), clubs grid, forms open now with countdowns, realtime activity feed, latest notices, student tools.</w:t>
             </w:r>
           </w:p>
         </w:tc>
@@ -2315,6 +2424,106 @@
           </w:p>
         </w:tc>
       </w:tr>
+      <w:tr>
+        <w:tc>
+          <w:tcPr>
+            <w:tcW w:w="3009" w:type="dxa"/>
+            <w:shd w:val="clear" w:color="auto" w:fill="FFFFFF"/>
+            <w:vAlign w:val="center"/>
+          </w:tcPr>
+          <w:p>
+            <w:pPr>
+              <w:spacing w:after="0" w:line="260" w:lineRule="auto"/>
+            </w:pPr>
+            <w:r>
+              <w:t xml:space="preserve">Student directory</w:t>
+            </w:r>
+          </w:p>
+        </w:tc>
+        <w:tc>
+          <w:tcPr>
+            <w:tcW w:w="3009" w:type="dxa"/>
+            <w:shd w:val="clear" w:color="auto" w:fill="FFFFFF"/>
+            <w:vAlign w:val="center"/>
+          </w:tcPr>
+          <w:p>
+            <w:pPr>
+              <w:spacing w:after="0" w:line="260" w:lineRule="auto"/>
+            </w:pPr>
+            <w:r>
+              <w:rPr>
+                <w:rFonts w:ascii="Consolas" w:hAnsi="Consolas" w:cs="Consolas"/>
+              </w:rPr>
+              <w:t xml:space="preserve">#/students</w:t>
+            </w:r>
+          </w:p>
+        </w:tc>
+        <w:tc>
+          <w:tcPr>
+            <w:tcW w:w="3009" w:type="dxa"/>
+            <w:shd w:val="clear" w:color="auto" w:fill="FFFFFF"/>
+            <w:vAlign w:val="center"/>
+          </w:tcPr>
+          <w:p>
+            <w:pPr>
+              <w:spacing w:after="0" w:line="260" w:lineRule="auto"/>
+            </w:pPr>
+            <w:r>
+              <w:t xml:space="preserve">Official student roster — admin-only (hidden from the public navigation).</w:t>
+            </w:r>
+          </w:p>
+        </w:tc>
+      </w:tr>
+      <w:tr>
+        <w:tc>
+          <w:tcPr>
+            <w:tcW w:w="3009" w:type="dxa"/>
+            <w:shd w:val="clear" w:color="auto" w:fill="F5F7FB"/>
+            <w:vAlign w:val="center"/>
+          </w:tcPr>
+          <w:p>
+            <w:pPr>
+              <w:spacing w:after="0" w:line="260" w:lineRule="auto"/>
+            </w:pPr>
+            <w:r>
+              <w:t xml:space="preserve">Student profile</w:t>
+            </w:r>
+          </w:p>
+        </w:tc>
+        <w:tc>
+          <w:tcPr>
+            <w:tcW w:w="3009" w:type="dxa"/>
+            <w:shd w:val="clear" w:color="auto" w:fill="F5F7FB"/>
+            <w:vAlign w:val="center"/>
+          </w:tcPr>
+          <w:p>
+            <w:pPr>
+              <w:spacing w:after="0" w:line="260" w:lineRule="auto"/>
+            </w:pPr>
+            <w:r>
+              <w:rPr>
+                <w:rFonts w:ascii="Consolas" w:hAnsi="Consolas" w:cs="Consolas"/>
+              </w:rPr>
+              <w:t xml:space="preserve">#/student/:key</w:t>
+            </w:r>
+          </w:p>
+        </w:tc>
+        <w:tc>
+          <w:tcPr>
+            <w:tcW w:w="3009" w:type="dxa"/>
+            <w:shd w:val="clear" w:color="auto" w:fill="F5F7FB"/>
+            <w:vAlign w:val="center"/>
+          </w:tcPr>
+          <w:p>
+            <w:pPr>
+              <w:spacing w:after="0" w:line="260" w:lineRule="auto"/>
+            </w:pPr>
+            <w:r>
+              <w:t xml:space="preserve">Public per-student profile page with an initials avatar.</w:t>
+            </w:r>
+          </w:p>
+        </w:tc>
+      </w:tr>
     </w:tbl>
     <w:p>
       <w:pPr>
@@ -2331,7 +2540,7 @@
     </w:p>
     <w:p>
       <w:r>
-        <w:t xml:space="preserve">Signed-in executives and admins manage their club from the portal dashboard, organised into five tabs:</w:t>
+        <w:t xml:space="preserve">Signed-in executives and admins manage their club from the portal dashboard — eight tabs in the legacy app, seven in the Next.js app:</w:t>
       </w:r>
     </w:p>
     <w:tbl>
@@ -2463,7 +2672,7 @@
               <w:spacing w:after="0" w:line="260" w:lineRule="auto"/>
             </w:pPr>
             <w:r>
-              <w:t xml:space="preserve">Build forms with a visual field builder (see §4.4), edit scheduling, view per-form analytics and submission counts.</w:t>
+              <w:t xml:space="preserve">Build forms with a visual field builder (see §4.5), edit scheduling, view per-form analytics and submission counts.</w:t>
             </w:r>
           </w:p>
         </w:tc>
@@ -2512,6 +2721,102 @@
               <w:spacing w:after="0" w:line="260" w:lineRule="auto"/>
             </w:pPr>
             <w:r>
+              <w:t xml:space="preserve">Memberships</w:t>
+            </w:r>
+          </w:p>
+        </w:tc>
+        <w:tc>
+          <w:tcPr>
+            <w:tcW w:w="4513" w:type="dxa"/>
+            <w:shd w:val="clear" w:color="auto" w:fill="F5F7FB"/>
+            <w:vAlign w:val="center"/>
+          </w:tcPr>
+          <w:p>
+            <w:pPr>
+              <w:spacing w:after="0" w:line="260" w:lineRule="auto"/>
+            </w:pPr>
+            <w:r>
+              <w:t xml:space="preserve">Review club join requests and approve or decline them (legacy: membership requests).</w:t>
+            </w:r>
+          </w:p>
+        </w:tc>
+      </w:tr>
+      <w:tr>
+        <w:tc>
+          <w:tcPr>
+            <w:tcW w:w="4513" w:type="dxa"/>
+            <w:shd w:val="clear" w:color="auto" w:fill="FFFFFF"/>
+            <w:vAlign w:val="center"/>
+          </w:tcPr>
+          <w:p>
+            <w:pPr>
+              <w:spacing w:after="0" w:line="260" w:lineRule="auto"/>
+            </w:pPr>
+            <w:r>
+              <w:t xml:space="preserve">Events</w:t>
+            </w:r>
+          </w:p>
+        </w:tc>
+        <w:tc>
+          <w:tcPr>
+            <w:tcW w:w="4513" w:type="dxa"/>
+            <w:shd w:val="clear" w:color="auto" w:fill="FFFFFF"/>
+            <w:vAlign w:val="center"/>
+          </w:tcPr>
+          <w:p>
+            <w:pPr>
+              <w:spacing w:after="0" w:line="260" w:lineRule="auto"/>
+            </w:pPr>
+            <w:r>
+              <w:t xml:space="preserve">Post club events with date, venue and capacity (legacy app).</w:t>
+            </w:r>
+          </w:p>
+        </w:tc>
+      </w:tr>
+      <w:tr>
+        <w:tc>
+          <w:tcPr>
+            <w:tcW w:w="4513" w:type="dxa"/>
+            <w:shd w:val="clear" w:color="auto" w:fill="F5F7FB"/>
+            <w:vAlign w:val="center"/>
+          </w:tcPr>
+          <w:p>
+            <w:pPr>
+              <w:spacing w:after="0" w:line="260" w:lineRule="auto"/>
+            </w:pPr>
+            <w:r>
+              <w:t xml:space="preserve">Ads</w:t>
+            </w:r>
+          </w:p>
+        </w:tc>
+        <w:tc>
+          <w:tcPr>
+            <w:tcW w:w="4513" w:type="dxa"/>
+            <w:shd w:val="clear" w:color="auto" w:fill="F5F7FB"/>
+            <w:vAlign w:val="center"/>
+          </w:tcPr>
+          <w:p>
+            <w:pPr>
+              <w:spacing w:after="0" w:line="260" w:lineRule="auto"/>
+            </w:pPr>
+            <w:r>
+              <w:t xml:space="preserve">Publish image/video ads for events — see §4.7.</w:t>
+            </w:r>
+          </w:p>
+        </w:tc>
+      </w:tr>
+      <w:tr>
+        <w:tc>
+          <w:tcPr>
+            <w:tcW w:w="4513" w:type="dxa"/>
+            <w:shd w:val="clear" w:color="auto" w:fill="FFFFFF"/>
+            <w:vAlign w:val="center"/>
+          </w:tcPr>
+          <w:p>
+            <w:pPr>
+              <w:spacing w:after="0" w:line="260" w:lineRule="auto"/>
+            </w:pPr>
+            <w:r>
               <w:t xml:space="preserve">Complaints</w:t>
             </w:r>
           </w:p>
@@ -2519,7 +2824,7 @@
         <w:tc>
           <w:tcPr>
             <w:tcW w:w="4513" w:type="dxa"/>
-            <w:shd w:val="clear" w:color="auto" w:fill="F5F7FB"/>
+            <w:shd w:val="clear" w:color="auto" w:fill="FFFFFF"/>
             <w:vAlign w:val="center"/>
           </w:tcPr>
           <w:p>
@@ -2536,7 +2841,7 @@
         <w:tc>
           <w:tcPr>
             <w:tcW w:w="4513" w:type="dxa"/>
-            <w:shd w:val="clear" w:color="auto" w:fill="FFFFFF"/>
+            <w:shd w:val="clear" w:color="auto" w:fill="F5F7FB"/>
             <w:vAlign w:val="center"/>
           </w:tcPr>
           <w:p>
@@ -2551,15 +2856,15 @@
         <w:tc>
           <w:tcPr>
             <w:tcW w:w="4513" w:type="dxa"/>
-            <w:shd w:val="clear" w:color="auto" w:fill="FFFFFF"/>
-            <w:vAlign w:val="center"/>
-          </w:tcPr>
-          <w:p>
-            <w:pPr>
-              <w:spacing w:after="0" w:line="260" w:lineRule="auto"/>
-            </w:pPr>
-            <w:r>
-              <w:t xml:space="preserve">Add a new club, manage members &amp; roles, export/import JSON backups, reset local data, load sample data to the cloud.</w:t>
+            <w:shd w:val="clear" w:color="auto" w:fill="F5F7FB"/>
+            <w:vAlign w:val="center"/>
+          </w:tcPr>
+          <w:p>
+            <w:pPr>
+              <w:spacing w:after="0" w:line="260" w:lineRule="auto"/>
+            </w:pPr>
+            <w:r>
+              <w:t xml:space="preserve">Edit the club's committee &amp; photos (§4.9), add a new club, manage members &amp; roles, export/import JSON backups, reset local data, load sample data to the cloud.</w:t>
             </w:r>
           </w:p>
         </w:tc>
@@ -2730,7 +3035,7 @@
               <w:spacing w:after="0" w:line="260" w:lineRule="auto"/>
             </w:pPr>
             <w:r>
-              <w:t xml:space="preserve">Public access plus the ability to track their own submissions.</w:t>
+              <w:t xml:space="preserve">Public access plus the ability to track their own submissions, join requests and dashboard.</w:t>
             </w:r>
           </w:p>
         </w:tc>
@@ -2762,16 +3067,48 @@
               <w:spacing w:after="0" w:line="260" w:lineRule="auto"/>
             </w:pPr>
             <w:r>
-              <w:t xml:space="preserve">Manage the clubs they are assigned to — notices, forms, submissions, complaints.</w:t>
-            </w:r>
-          </w:p>
-        </w:tc>
-      </w:tr>
-      <w:tr>
-        <w:tc>
-          <w:tcPr>
-            <w:tcW w:w="4513" w:type="dxa"/>
-            <w:shd w:val="clear" w:color="auto" w:fill="F5F7FB"/>
+              <w:t xml:space="preserve">Manage the clubs they are assigned to — notices, forms, submissions, complaints, ads and the committee.</w:t>
+            </w:r>
+          </w:p>
+        </w:tc>
+      </w:tr>
+      <w:tr>
+        <w:tc>
+          <w:tcPr>
+            <w:tcW w:w="4513" w:type="dxa"/>
+            <w:shd w:val="clear" w:color="auto" w:fill="F5F7FB"/>
+            <w:vAlign w:val="center"/>
+          </w:tcPr>
+          <w:p>
+            <w:pPr>
+              <w:spacing w:after="0" w:line="260" w:lineRule="auto"/>
+            </w:pPr>
+            <w:r>
+              <w:t xml:space="preserve">IT Staff</w:t>
+            </w:r>
+          </w:p>
+        </w:tc>
+        <w:tc>
+          <w:tcPr>
+            <w:tcW w:w="4513" w:type="dxa"/>
+            <w:shd w:val="clear" w:color="auto" w:fill="F5F7FB"/>
+            <w:vAlign w:val="center"/>
+          </w:tcPr>
+          <w:p>
+            <w:pPr>
+              <w:spacing w:after="0" w:line="260" w:lineRule="auto"/>
+            </w:pPr>
+            <w:r>
+              <w:t xml:space="preserve">Admin-granted role that unlocks the campus IT helpdesk.</w:t>
+            </w:r>
+          </w:p>
+        </w:tc>
+      </w:tr>
+      <w:tr>
+        <w:tc>
+          <w:tcPr>
+            <w:tcW w:w="4513" w:type="dxa"/>
+            <w:shd w:val="clear" w:color="auto" w:fill="FFFFFF"/>
             <w:vAlign w:val="center"/>
           </w:tcPr>
           <w:p>
@@ -2786,7 +3123,7 @@
         <w:tc>
           <w:tcPr>
             <w:tcW w:w="4513" w:type="dxa"/>
-            <w:shd w:val="clear" w:color="auto" w:fill="F5F7FB"/>
+            <w:shd w:val="clear" w:color="auto" w:fill="FFFFFF"/>
             <w:vAlign w:val="center"/>
           </w:tcPr>
           <w:p>
@@ -2810,7 +3147,7 @@
         <w:pStyle w:val="Heading2"/>
       </w:pPr>
       <w:r>
-        <w:t xml:space="preserve">4.4 Form Engine</w:t>
+        <w:t xml:space="preserve">4.5 Form Engine</w:t>
       </w:r>
     </w:p>
     <w:p>
@@ -3168,7 +3505,7 @@
         <w:pStyle w:val="Heading2"/>
       </w:pPr>
       <w:r>
-        <w:t xml:space="preserve">4.5 Realtime &amp; Live Feedback</w:t>
+        <w:t xml:space="preserve">4.6 Realtime &amp; Live Feedback</w:t>
       </w:r>
     </w:p>
     <w:p>
@@ -3220,7 +3557,7 @@
         <w:pStyle w:val="Heading2"/>
       </w:pPr>
       <w:r>
-        <w:t xml:space="preserve">4.6 Student Tools</w:t>
+        <w:t xml:space="preserve">4.7 Student Tools</w:t>
       </w:r>
     </w:p>
     <w:p>
@@ -3235,6 +3572,364 @@
       </w:r>
       <w:r>
         <w:t xml:space="preserve"> for reporting campus IT issues — WiFi/internet, computer labs, email/portal, hardware/equipment, software/access and other categories. Complaints may be filed anonymously and carry a status lifecycle (open → in progress → resolved) with staff replies.</w:t>
+      </w:r>
+    </w:p>
+    <w:p>
+      <w:pPr>
+        <w:pStyle w:val="Heading2"/>
+      </w:pPr>
+      <w:r>
+        <w:t xml:space="preserve">4.8 Club Ads (moderator-published)</w:t>
+      </w:r>
+    </w:p>
+    <w:p>
+      <w:r>
+        <w:t xml:space="preserve">Every club moderator can publish </w:t>
+      </w:r>
+      <w:r>
+        <w:rPr>
+          <w:b/>
+        </w:rPr>
+        <w:t xml:space="preserve">image or video ads</w:t>
+      </w:r>
+      <w:r>
+        <w:t xml:space="preserve"> for events from the portal's </w:t>
+      </w:r>
+      <w:r>
+        <w:rPr>
+          <w:i/>
+        </w:rPr>
+        <w:t xml:space="preserve">Ads</w:t>
+      </w:r>
+      <w:r>
+        <w:t xml:space="preserve"> tab. A published ad appears in the </w:t>
+      </w:r>
+      <w:r>
+        <w:rPr>
+          <w:b/>
+        </w:rPr>
+        <w:t xml:space="preserve">sponsored carousel</w:t>
+      </w:r>
+      <w:r>
+        <w:t xml:space="preserve"> on the homepage (and in the legacy app it also advertises the club's own page), rotating every six seconds with dots and prev/next controls. Autoplay honours </w:t>
+      </w:r>
+      <w:r>
+        <w:rPr>
+          <w:rFonts w:ascii="Consolas" w:hAnsi="Consolas" w:cs="Consolas"/>
+        </w:rPr>
+        <w:t xml:space="preserve">prefers-reduced-motion</w:t>
+      </w:r>
+      <w:r>
+        <w:t xml:space="preserve"> and pauses on hover.</w:t>
+      </w:r>
+    </w:p>
+    <w:p>
+      <w:pPr>
+        <w:ind w:left="420" w:hanging="220"/>
+      </w:pPr>
+      <w:r>
+        <w:t xml:space="preserve">•  </w:t>
+      </w:r>
+      <w:r>
+        <w:rPr>
+          <w:b/>
+        </w:rPr>
+        <w:t xml:space="preserve">Media</w:t>
+      </w:r>
+      <w:r>
+        <w:t xml:space="preserve"> — upload an image or video file, or paste a URL. Images are downscaled client-side (max 1200 px, JPEG) and videos are capped at 15 MB; images at 8 MB.</w:t>
+      </w:r>
+    </w:p>
+    <w:p>
+      <w:pPr>
+        <w:ind w:left="420" w:hanging="220"/>
+      </w:pPr>
+      <w:r>
+        <w:t xml:space="preserve">•  </w:t>
+      </w:r>
+      <w:r>
+        <w:rPr>
+          <w:b/>
+        </w:rPr>
+        <w:t xml:space="preserve">Uploads</w:t>
+      </w:r>
+      <w:r>
+        <w:t xml:space="preserve"> — in the Next.js app, media is uploaded to Firebase Storage under </w:t>
+      </w:r>
+      <w:r>
+        <w:rPr>
+          <w:rFonts w:ascii="Consolas" w:hAnsi="Consolas" w:cs="Consolas"/>
+        </w:rPr>
+        <w:t xml:space="preserve">ad-media/{clubId}/</w:t>
+      </w:r>
+      <w:r>
+        <w:t xml:space="preserve"> when connected, keeping Firestore documents small; offline mode stores an inline data URL (matching the legacy app).</w:t>
+      </w:r>
+    </w:p>
+    <w:p>
+      <w:pPr>
+        <w:ind w:left="420" w:hanging="220"/>
+      </w:pPr>
+      <w:r>
+        <w:t xml:space="preserve">•  </w:t>
+      </w:r>
+      <w:r>
+        <w:rPr>
+          <w:b/>
+        </w:rPr>
+        <w:t xml:space="preserve">Link target</w:t>
+      </w:r>
+      <w:r>
+        <w:t xml:space="preserve"> — each ad links to the club page, a specific club form ("Apply now"), or an external URL.</w:t>
+      </w:r>
+    </w:p>
+    <w:p>
+      <w:pPr>
+        <w:ind w:left="420" w:hanging="220"/>
+      </w:pPr>
+      <w:r>
+        <w:t xml:space="preserve">•  </w:t>
+      </w:r>
+      <w:r>
+        <w:rPr>
+          <w:b/>
+        </w:rPr>
+        <w:t xml:space="preserve">Lifecycle</w:t>
+      </w:r>
+      <w:r>
+        <w:t xml:space="preserve"> — ads are </w:t>
+      </w:r>
+      <w:r>
+        <w:rPr>
+          <w:rFonts w:ascii="Consolas" w:hAnsi="Consolas" w:cs="Consolas"/>
+        </w:rPr>
+        <w:t xml:space="preserve">active</w:t>
+      </w:r>
+      <w:r>
+        <w:t xml:space="preserve"> or </w:t>
+      </w:r>
+      <w:r>
+        <w:rPr>
+          <w:rFonts w:ascii="Consolas" w:hAnsi="Consolas" w:cs="Consolas"/>
+        </w:rPr>
+        <w:t xml:space="preserve">paused</w:t>
+      </w:r>
+      <w:r>
+        <w:t xml:space="preserve">; moderators can pause, resume, edit or delete their club's ads. Paused ads disappear from the carousel immediately.</w:t>
+      </w:r>
+    </w:p>
+    <w:p>
+      <w:pPr>
+        <w:ind w:left="420" w:hanging="220"/>
+      </w:pPr>
+      <w:r>
+        <w:t xml:space="preserve">•  </w:t>
+      </w:r>
+      <w:r>
+        <w:rPr>
+          <w:b/>
+        </w:rPr>
+        <w:t xml:space="preserve">Access control</w:t>
+      </w:r>
+      <w:r>
+        <w:t xml:space="preserve"> — the Ads tab is role-gated: only the club's moderators (executives assigned to the club) and admins can manage its ads (</w:t>
+      </w:r>
+      <w:r>
+        <w:rPr>
+          <w:rFonts w:ascii="Consolas" w:hAnsi="Consolas" w:cs="Consolas"/>
+        </w:rPr>
+        <w:t xml:space="preserve">canManageClub</w:t>
+      </w:r>
+      <w:r>
+        <w:t xml:space="preserve">).</w:t>
+      </w:r>
+    </w:p>
+    <w:p>
+      <w:pPr>
+        <w:pStyle w:val="Heading2"/>
+      </w:pPr>
+      <w:r>
+        <w:t xml:space="preserve">4.9 Club Events</w:t>
+      </w:r>
+    </w:p>
+    <w:p>
+      <w:r>
+        <w:t xml:space="preserve">Clubs post </w:t>
+      </w:r>
+      <w:r>
+        <w:rPr>
+          <w:b/>
+        </w:rPr>
+        <w:t xml:space="preserve">events</w:t>
+      </w:r>
+      <w:r>
+        <w:t xml:space="preserve"> (title, description, start/end time, venue, capacity) from the portal. Events appear on the club page, the homepage and each member's dashboard, and are capped by capacity.</w:t>
+      </w:r>
+    </w:p>
+    <w:p>
+      <w:pPr>
+        <w:pStyle w:val="Heading2"/>
+      </w:pPr>
+      <w:r>
+        <w:t xml:space="preserve">4.10 Memberships &amp; Committee Management</w:t>
+      </w:r>
+    </w:p>
+    <w:p>
+      <w:pPr>
+        <w:ind w:left="420" w:hanging="220"/>
+      </w:pPr>
+      <w:r>
+        <w:t xml:space="preserve">•  </w:t>
+      </w:r>
+      <w:r>
+        <w:rPr>
+          <w:b/>
+        </w:rPr>
+        <w:t xml:space="preserve">Memberships</w:t>
+      </w:r>
+      <w:r>
+        <w:t xml:space="preserve"> — students request membership from a club page; moderators review and approve or decline each request from the portal. Approved members see their club on the dashboard.</w:t>
+      </w:r>
+    </w:p>
+    <w:p>
+      <w:pPr>
+        <w:ind w:left="420" w:hanging="220"/>
+      </w:pPr>
+      <w:r>
+        <w:t xml:space="preserve">•  </w:t>
+      </w:r>
+      <w:r>
+        <w:rPr>
+          <w:b/>
+        </w:rPr>
+        <w:t xml:space="preserve">Committee editor</w:t>
+      </w:r>
+      <w:r>
+        <w:t xml:space="preserve"> — the Settings tab lets a club's moderator edit the executive committee (role, name, photo — upload or URL). Every save is logged in a public </w:t>
+      </w:r>
+      <w:r>
+        <w:rPr>
+          <w:i/>
+        </w:rPr>
+        <w:t xml:space="preserve">committee history</w:t>
+      </w:r>
+      <w:r>
+        <w:t xml:space="preserve"> on the club page and the club's moderators are emailed via </w:t>
+      </w:r>
+      <w:r>
+        <w:rPr>
+          <w:rFonts w:ascii="Consolas" w:hAnsi="Consolas" w:cs="Consolas"/>
+        </w:rPr>
+        <w:t xml:space="preserve">POST /api/committee-notify</w:t>
+      </w:r>
+      <w:r>
+        <w:t xml:space="preserve">.</w:t>
+      </w:r>
+    </w:p>
+    <w:p>
+      <w:pPr>
+        <w:ind w:left="420" w:hanging="220"/>
+      </w:pPr>
+      <w:r>
+        <w:t xml:space="preserve">•  </w:t>
+      </w:r>
+      <w:r>
+        <w:rPr>
+          <w:b/>
+        </w:rPr>
+        <w:t xml:space="preserve">Student dashboard</w:t>
+      </w:r>
+      <w:r>
+        <w:t xml:space="preserve"> — signed-in students get a personal dashboard tracking their memberships, submissions and approvals.</w:t>
+      </w:r>
+    </w:p>
+    <w:p>
+      <w:pPr>
+        <w:pStyle w:val="Heading2"/>
+      </w:pPr>
+      <w:r>
+        <w:t xml:space="preserve">4.11 Student Directory &amp; Public Profiles</w:t>
+      </w:r>
+    </w:p>
+    <w:p>
+      <w:r>
+        <w:t xml:space="preserve">The portal ships an </w:t>
+      </w:r>
+      <w:r>
+        <w:rPr>
+          <w:b/>
+        </w:rPr>
+        <w:t xml:space="preserve">official student roster</w:t>
+      </w:r>
+      <w:r>
+        <w:t xml:space="preserve"> (B.Sc. CSE session 2025–26 and the full institute section lists). The directory is </w:t>
+      </w:r>
+      <w:r>
+        <w:rPr>
+          <w:b/>
+        </w:rPr>
+        <w:t xml:space="preserve">admin-only</w:t>
+      </w:r>
+      <w:r>
+        <w:t xml:space="preserve"> — the footer link is hidden for everyone else — and is backed by the Appwrite </w:t>
+      </w:r>
+      <w:r>
+        <w:rPr>
+          <w:rFonts w:ascii="Consolas" w:hAnsi="Consolas" w:cs="Consolas"/>
+        </w:rPr>
+        <w:t xml:space="preserve">students</w:t>
+      </w:r>
+      <w:r>
+        <w:t xml:space="preserve"> collection when configured, falling back to the bundled roster offline. Each student gets a public profile page with an initials avatar.</w:t>
+      </w:r>
+    </w:p>
+    <w:p>
+      <w:pPr>
+        <w:pStyle w:val="Heading2"/>
+      </w:pPr>
+      <w:r>
+        <w:t xml:space="preserve">4.12 Appwrite Mirroring</w:t>
+      </w:r>
+    </w:p>
+    <w:p>
+      <w:r>
+        <w:t xml:space="preserve">Both apps can optionally </w:t>
+      </w:r>
+      <w:r>
+        <w:rPr>
+          <w:b/>
+        </w:rPr>
+        <w:t xml:space="preserve">mirror data to Appwrite</w:t>
+      </w:r>
+      <w:r>
+        <w:t xml:space="preserve"> alongside Firebase/local storage. The static site mirrors form submissions and student accounts through its </w:t>
+      </w:r>
+      <w:r>
+        <w:rPr>
+          <w:rFonts w:ascii="Consolas" w:hAnsi="Consolas" w:cs="Consolas"/>
+        </w:rPr>
+        <w:t xml:space="preserve">DATA_API</w:t>
+      </w:r>
+      <w:r>
+        <w:t xml:space="preserve"> origin; the Next.js app writes through </w:t>
+      </w:r>
+      <w:r>
+        <w:rPr>
+          <w:rFonts w:ascii="Consolas" w:hAnsi="Consolas" w:cs="Consolas"/>
+        </w:rPr>
+        <w:t xml:space="preserve">POST /api/submissions</w:t>
+      </w:r>
+      <w:r>
+        <w:t xml:space="preserve"> (idempotent per form + submitter email, photo data-URLs dropped, payload capped) and </w:t>
+      </w:r>
+      <w:r>
+        <w:rPr>
+          <w:rFonts w:ascii="Consolas" w:hAnsi="Consolas" w:cs="Consolas"/>
+        </w:rPr>
+        <w:t xml:space="preserve">POST /api/users</w:t>
+      </w:r>
+      <w:r>
+        <w:t xml:space="preserve">. The Appwrite write is always best-effort — a slow or offline backend never blocks the student.</w:t>
       </w:r>
     </w:p>
     <w:p>
@@ -3387,7 +4082,7 @@
               <w:spacing w:after="0" w:line="260" w:lineRule="auto"/>
             </w:pPr>
             <w:r>
-              <w:t xml:space="preserve">Structured, realtime-synchronised data (clubs, notices, forms, submissions, complaints, users).</w:t>
+              <w:t xml:space="preserve">Structured, realtime-synchronised data (clubs, notices, forms, submissions, complaints, memberships, events, ads, users).</w:t>
             </w:r>
           </w:p>
         </w:tc>
@@ -3481,7 +4176,7 @@
               <w:spacing w:after="0" w:line="260" w:lineRule="auto"/>
             </w:pPr>
             <w:r>
-              <w:t xml:space="preserve">Submission photos and attachments, stored under </w:t>
+              <w:t xml:space="preserve">Submission photos under </w:t>
             </w:r>
             <w:r>
               <w:rPr>
@@ -3490,6 +4185,15 @@
               <w:t xml:space="preserve">submission-photos/</w:t>
             </w:r>
             <w:r>
+              <w:t xml:space="preserve"> and ad media under </w:t>
+            </w:r>
+            <w:r>
+              <w:rPr>
+                <w:rFonts w:ascii="Consolas" w:hAnsi="Consolas" w:cs="Consolas"/>
+              </w:rPr>
+              <w:t xml:space="preserve">ad-media/{clubId}/</w:t>
+            </w:r>
+            <w:r>
               <w:t xml:space="preserve">.</w:t>
             </w:r>
           </w:p>
@@ -3593,7 +4297,16 @@
               <w:spacing w:after="0" w:line="260" w:lineRule="auto"/>
             </w:pPr>
             <w:r>
-              <w:t xml:space="preserve">Provisioning script + MCP server configs for an Appwrite-hosted schema.</w:t>
+              <w:t xml:space="preserve">Provisioning + seed scripts and MCP server configs for an Appwrite-hosted schema; the web app reads the student directory and mirrors submissions/accounts through </w:t>
+            </w:r>
+            <w:r>
+              <w:rPr>
+                <w:rFonts w:ascii="Consolas" w:hAnsi="Consolas" w:cs="Consolas"/>
+              </w:rPr>
+              <w:t xml:space="preserve">/api</w:t>
+            </w:r>
+            <w:r>
+              <w:t xml:space="preserve"> routes.</w:t>
             </w:r>
           </w:p>
         </w:tc>
@@ -4111,6 +4824,80 @@
               <w:spacing w:after="0" w:line="260" w:lineRule="auto"/>
             </w:pPr>
             <w:r>
+              <w:t xml:space="preserve">API routes</w:t>
+            </w:r>
+          </w:p>
+        </w:tc>
+        <w:tc>
+          <w:tcPr>
+            <w:tcW w:w="4513" w:type="dxa"/>
+            <w:shd w:val="clear" w:color="auto" w:fill="F5F7FB"/>
+            <w:vAlign w:val="center"/>
+          </w:tcPr>
+          <w:p>
+            <w:pPr>
+              <w:spacing w:after="0" w:line="260" w:lineRule="auto"/>
+            </w:pPr>
+            <w:r>
+              <w:rPr>
+                <w:rFonts w:ascii="Consolas" w:hAnsi="Consolas" w:cs="Consolas"/>
+              </w:rPr>
+              <w:t xml:space="preserve">app/api/</w:t>
+            </w:r>
+            <w:r>
+              <w:t xml:space="preserve"> — </w:t>
+            </w:r>
+            <w:r>
+              <w:rPr>
+                <w:rFonts w:ascii="Consolas" w:hAnsi="Consolas" w:cs="Consolas"/>
+              </w:rPr>
+              <w:t xml:space="preserve">/api/students</w:t>
+            </w:r>
+            <w:r>
+              <w:t xml:space="preserve"> (Appwrite-backed directory), </w:t>
+            </w:r>
+            <w:r>
+              <w:rPr>
+                <w:rFonts w:ascii="Consolas" w:hAnsi="Consolas" w:cs="Consolas"/>
+              </w:rPr>
+              <w:t xml:space="preserve">/api/submissions</w:t>
+            </w:r>
+            <w:r>
+              <w:t xml:space="preserve"> and </w:t>
+            </w:r>
+            <w:r>
+              <w:rPr>
+                <w:rFonts w:ascii="Consolas" w:hAnsi="Consolas" w:cs="Consolas"/>
+              </w:rPr>
+              <w:t xml:space="preserve">/api/users</w:t>
+            </w:r>
+            <w:r>
+              <w:t xml:space="preserve"> (Appwrite mirror), </w:t>
+            </w:r>
+            <w:r>
+              <w:rPr>
+                <w:rFonts w:ascii="Consolas" w:hAnsi="Consolas" w:cs="Consolas"/>
+              </w:rPr>
+              <w:t xml:space="preserve">/api/committee-notify</w:t>
+            </w:r>
+            <w:r>
+              <w:t xml:space="preserve"> (moderator emails)</w:t>
+            </w:r>
+          </w:p>
+        </w:tc>
+      </w:tr>
+      <w:tr>
+        <w:tc>
+          <w:tcPr>
+            <w:tcW w:w="4513" w:type="dxa"/>
+            <w:shd w:val="clear" w:color="auto" w:fill="FFFFFF"/>
+            <w:vAlign w:val="center"/>
+          </w:tcPr>
+          <w:p>
+            <w:pPr>
+              <w:spacing w:after="0" w:line="260" w:lineRule="auto"/>
+            </w:pPr>
+            <w:r>
               <w:t xml:space="preserve">Tooling</w:t>
             </w:r>
           </w:p>
@@ -4118,7 +4905,7 @@
         <w:tc>
           <w:tcPr>
             <w:tcW w:w="4513" w:type="dxa"/>
-            <w:shd w:val="clear" w:color="auto" w:fill="F5F7FB"/>
+            <w:shd w:val="clear" w:color="auto" w:fill="FFFFFF"/>
             <w:vAlign w:val="center"/>
           </w:tcPr>
           <w:p>
@@ -4665,6 +5452,210 @@
               <w:rPr>
                 <w:rFonts w:ascii="Consolas" w:hAnsi="Consolas" w:cs="Consolas"/>
               </w:rPr>
+              <w:t xml:space="preserve">memberships</w:t>
+            </w:r>
+          </w:p>
+        </w:tc>
+        <w:tc>
+          <w:tcPr>
+            <w:tcW w:w="2257" w:type="dxa"/>
+            <w:shd w:val="clear" w:color="auto" w:fill="F5F7FB"/>
+            <w:vAlign w:val="center"/>
+          </w:tcPr>
+          <w:p>
+            <w:pPr>
+              <w:spacing w:after="0" w:line="260" w:lineRule="auto"/>
+            </w:pPr>
+            <w:r>
+              <w:t xml:space="preserve">One doc per join request</w:t>
+            </w:r>
+          </w:p>
+        </w:tc>
+        <w:tc>
+          <w:tcPr>
+            <w:tcW w:w="2257" w:type="dxa"/>
+            <w:shd w:val="clear" w:color="auto" w:fill="F5F7FB"/>
+            <w:vAlign w:val="center"/>
+          </w:tcPr>
+          <w:p>
+            <w:pPr>
+              <w:spacing w:after="0" w:line="260" w:lineRule="auto"/>
+            </w:pPr>
+            <w:r>
+              <w:t xml:space="preserve">Self / club staff</w:t>
+            </w:r>
+          </w:p>
+        </w:tc>
+        <w:tc>
+          <w:tcPr>
+            <w:tcW w:w="2257" w:type="dxa"/>
+            <w:shd w:val="clear" w:color="auto" w:fill="F5F7FB"/>
+            <w:vAlign w:val="center"/>
+          </w:tcPr>
+          <w:p>
+            <w:pPr>
+              <w:spacing w:after="0" w:line="260" w:lineRule="auto"/>
+            </w:pPr>
+            <w:r>
+              <w:t xml:space="preserve">Anyone (requesting); staff (reviewing)</w:t>
+            </w:r>
+          </w:p>
+        </w:tc>
+      </w:tr>
+      <w:tr>
+        <w:tc>
+          <w:tcPr>
+            <w:tcW w:w="2257" w:type="dxa"/>
+            <w:shd w:val="clear" w:color="auto" w:fill="FFFFFF"/>
+            <w:vAlign w:val="center"/>
+          </w:tcPr>
+          <w:p>
+            <w:pPr>
+              <w:spacing w:after="0" w:line="260" w:lineRule="auto"/>
+            </w:pPr>
+            <w:r>
+              <w:rPr>
+                <w:rFonts w:ascii="Consolas" w:hAnsi="Consolas" w:cs="Consolas"/>
+              </w:rPr>
+              <w:t xml:space="preserve">events</w:t>
+            </w:r>
+          </w:p>
+        </w:tc>
+        <w:tc>
+          <w:tcPr>
+            <w:tcW w:w="2257" w:type="dxa"/>
+            <w:shd w:val="clear" w:color="auto" w:fill="FFFFFF"/>
+            <w:vAlign w:val="center"/>
+          </w:tcPr>
+          <w:p>
+            <w:pPr>
+              <w:spacing w:after="0" w:line="260" w:lineRule="auto"/>
+            </w:pPr>
+            <w:r>
+              <w:t xml:space="preserve">One doc per club event</w:t>
+            </w:r>
+          </w:p>
+        </w:tc>
+        <w:tc>
+          <w:tcPr>
+            <w:tcW w:w="2257" w:type="dxa"/>
+            <w:shd w:val="clear" w:color="auto" w:fill="FFFFFF"/>
+            <w:vAlign w:val="center"/>
+          </w:tcPr>
+          <w:p>
+            <w:pPr>
+              <w:spacing w:after="0" w:line="260" w:lineRule="auto"/>
+            </w:pPr>
+            <w:r>
+              <w:t xml:space="preserve">Everyone</w:t>
+            </w:r>
+          </w:p>
+        </w:tc>
+        <w:tc>
+          <w:tcPr>
+            <w:tcW w:w="2257" w:type="dxa"/>
+            <w:shd w:val="clear" w:color="auto" w:fill="FFFFFF"/>
+            <w:vAlign w:val="center"/>
+          </w:tcPr>
+          <w:p>
+            <w:pPr>
+              <w:spacing w:after="0" w:line="260" w:lineRule="auto"/>
+            </w:pPr>
+            <w:r>
+              <w:t xml:space="preserve">Admins / executives of the club</w:t>
+            </w:r>
+          </w:p>
+        </w:tc>
+      </w:tr>
+      <w:tr>
+        <w:tc>
+          <w:tcPr>
+            <w:tcW w:w="2257" w:type="dxa"/>
+            <w:shd w:val="clear" w:color="auto" w:fill="F5F7FB"/>
+            <w:vAlign w:val="center"/>
+          </w:tcPr>
+          <w:p>
+            <w:pPr>
+              <w:spacing w:after="0" w:line="260" w:lineRule="auto"/>
+            </w:pPr>
+            <w:r>
+              <w:rPr>
+                <w:rFonts w:ascii="Consolas" w:hAnsi="Consolas" w:cs="Consolas"/>
+              </w:rPr>
+              <w:t xml:space="preserve">ads</w:t>
+            </w:r>
+          </w:p>
+        </w:tc>
+        <w:tc>
+          <w:tcPr>
+            <w:tcW w:w="2257" w:type="dxa"/>
+            <w:shd w:val="clear" w:color="auto" w:fill="F5F7FB"/>
+            <w:vAlign w:val="center"/>
+          </w:tcPr>
+          <w:p>
+            <w:pPr>
+              <w:spacing w:after="0" w:line="260" w:lineRule="auto"/>
+            </w:pPr>
+            <w:r>
+              <w:t xml:space="preserve">One doc per ad (</w:t>
+            </w:r>
+            <w:r>
+              <w:rPr>
+                <w:rFonts w:ascii="Consolas" w:hAnsi="Consolas" w:cs="Consolas"/>
+              </w:rPr>
+              <w:t xml:space="preserve">ad-…</w:t>
+            </w:r>
+            <w:r>
+              <w:t xml:space="preserve">)</w:t>
+            </w:r>
+          </w:p>
+        </w:tc>
+        <w:tc>
+          <w:tcPr>
+            <w:tcW w:w="2257" w:type="dxa"/>
+            <w:shd w:val="clear" w:color="auto" w:fill="F5F7FB"/>
+            <w:vAlign w:val="center"/>
+          </w:tcPr>
+          <w:p>
+            <w:pPr>
+              <w:spacing w:after="0" w:line="260" w:lineRule="auto"/>
+            </w:pPr>
+            <w:r>
+              <w:t xml:space="preserve">Everyone</w:t>
+            </w:r>
+          </w:p>
+        </w:tc>
+        <w:tc>
+          <w:tcPr>
+            <w:tcW w:w="2257" w:type="dxa"/>
+            <w:shd w:val="clear" w:color="auto" w:fill="F5F7FB"/>
+            <w:vAlign w:val="center"/>
+          </w:tcPr>
+          <w:p>
+            <w:pPr>
+              <w:spacing w:after="0" w:line="260" w:lineRule="auto"/>
+            </w:pPr>
+            <w:r>
+              <w:t xml:space="preserve">Admins / executives of the club</w:t>
+            </w:r>
+          </w:p>
+        </w:tc>
+      </w:tr>
+      <w:tr>
+        <w:tc>
+          <w:tcPr>
+            <w:tcW w:w="2257" w:type="dxa"/>
+            <w:shd w:val="clear" w:color="auto" w:fill="FFFFFF"/>
+            <w:vAlign w:val="center"/>
+          </w:tcPr>
+          <w:p>
+            <w:pPr>
+              <w:spacing w:after="0" w:line="260" w:lineRule="auto"/>
+            </w:pPr>
+            <w:r>
+              <w:rPr>
+                <w:rFonts w:ascii="Consolas" w:hAnsi="Consolas" w:cs="Consolas"/>
+              </w:rPr>
               <w:t xml:space="preserve">users/{uid}</w:t>
             </w:r>
           </w:p>
@@ -4672,7 +5663,7 @@
         <w:tc>
           <w:tcPr>
             <w:tcW w:w="2257" w:type="dxa"/>
-            <w:shd w:val="clear" w:color="auto" w:fill="F5F7FB"/>
+            <w:shd w:val="clear" w:color="auto" w:fill="FFFFFF"/>
             <w:vAlign w:val="center"/>
           </w:tcPr>
           <w:p>
@@ -4702,7 +5693,7 @@
         <w:tc>
           <w:tcPr>
             <w:tcW w:w="2257" w:type="dxa"/>
-            <w:shd w:val="clear" w:color="auto" w:fill="F5F7FB"/>
+            <w:shd w:val="clear" w:color="auto" w:fill="FFFFFF"/>
             <w:vAlign w:val="center"/>
           </w:tcPr>
           <w:p>
@@ -4717,7 +5708,7 @@
         <w:tc>
           <w:tcPr>
             <w:tcW w:w="2257" w:type="dxa"/>
-            <w:shd w:val="clear" w:color="auto" w:fill="F5F7FB"/>
+            <w:shd w:val="clear" w:color="auto" w:fill="FFFFFF"/>
             <w:vAlign w:val="center"/>
           </w:tcPr>
           <w:p>
@@ -4726,6 +5717,71 @@
             </w:pPr>
             <w:r>
               <w:t xml:space="preserve">Self (name only), admins (roles)</w:t>
+            </w:r>
+          </w:p>
+        </w:tc>
+      </w:tr>
+      <w:tr>
+        <w:tc>
+          <w:tcPr>
+            <w:tcW w:w="2257" w:type="dxa"/>
+            <w:shd w:val="clear" w:color="auto" w:fill="F5F7FB"/>
+            <w:vAlign w:val="center"/>
+          </w:tcPr>
+          <w:p>
+            <w:pPr>
+              <w:spacing w:after="0" w:line="260" w:lineRule="auto"/>
+            </w:pPr>
+            <w:r>
+              <w:rPr>
+                <w:rFonts w:ascii="Consolas" w:hAnsi="Consolas" w:cs="Consolas"/>
+              </w:rPr>
+              <w:t xml:space="preserve">config/site</w:t>
+            </w:r>
+          </w:p>
+        </w:tc>
+        <w:tc>
+          <w:tcPr>
+            <w:tcW w:w="2257" w:type="dxa"/>
+            <w:shd w:val="clear" w:color="auto" w:fill="F5F7FB"/>
+            <w:vAlign w:val="center"/>
+          </w:tcPr>
+          <w:p>
+            <w:pPr>
+              <w:spacing w:after="0" w:line="260" w:lineRule="auto"/>
+            </w:pPr>
+            <w:r>
+              <w:t xml:space="preserve">Institute name + semester list</w:t>
+            </w:r>
+          </w:p>
+        </w:tc>
+        <w:tc>
+          <w:tcPr>
+            <w:tcW w:w="2257" w:type="dxa"/>
+            <w:shd w:val="clear" w:color="auto" w:fill="F5F7FB"/>
+            <w:vAlign w:val="center"/>
+          </w:tcPr>
+          <w:p>
+            <w:pPr>
+              <w:spacing w:after="0" w:line="260" w:lineRule="auto"/>
+            </w:pPr>
+            <w:r>
+              <w:t xml:space="preserve">Everyone</w:t>
+            </w:r>
+          </w:p>
+        </w:tc>
+        <w:tc>
+          <w:tcPr>
+            <w:tcW w:w="2257" w:type="dxa"/>
+            <w:shd w:val="clear" w:color="auto" w:fill="F5F7FB"/>
+            <w:vAlign w:val="center"/>
+          </w:tcPr>
+          <w:p>
+            <w:pPr>
+              <w:spacing w:after="0" w:line="260" w:lineRule="auto"/>
+            </w:pPr>
+            <w:r>
+              <w:t xml:space="preserve">Admins</w:t>
             </w:r>
           </w:p>
         </w:tc>
@@ -4847,6 +5903,15 @@
         <w:rPr>
           <w:rFonts w:ascii="Consolas" w:hAnsi="Consolas" w:cs="Consolas"/>
         </w:rPr>
+        <w:t xml:space="preserve">it-staff</w:t>
+      </w:r>
+      <w:r>
+        <w:t xml:space="preserve">, </w:t>
+      </w:r>
+      <w:r>
+        <w:rPr>
+          <w:rFonts w:ascii="Consolas" w:hAnsi="Consolas" w:cs="Consolas"/>
+        </w:rPr>
         <w:t xml:space="preserve">member</w:t>
       </w:r>
       <w:r>
@@ -4970,6 +6035,139 @@
         <w:rPr>
           <w:b/>
         </w:rPr>
+        <w:t xml:space="preserve">Membership status</w:t>
+      </w:r>
+      <w:r>
+        <w:t xml:space="preserve"> — </w:t>
+      </w:r>
+      <w:r>
+        <w:rPr>
+          <w:rFonts w:ascii="Consolas" w:hAnsi="Consolas" w:cs="Consolas"/>
+        </w:rPr>
+        <w:t xml:space="preserve">pending</w:t>
+      </w:r>
+      <w:r>
+        <w:t xml:space="preserve">, </w:t>
+      </w:r>
+      <w:r>
+        <w:rPr>
+          <w:rFonts w:ascii="Consolas" w:hAnsi="Consolas" w:cs="Consolas"/>
+        </w:rPr>
+        <w:t xml:space="preserve">approved</w:t>
+      </w:r>
+      <w:r>
+        <w:t xml:space="preserve">, </w:t>
+      </w:r>
+      <w:r>
+        <w:rPr>
+          <w:rFonts w:ascii="Consolas" w:hAnsi="Consolas" w:cs="Consolas"/>
+        </w:rPr>
+        <w:t xml:space="preserve">rejected</w:t>
+      </w:r>
+      <w:r>
+        <w:t xml:space="preserve">.</w:t>
+      </w:r>
+    </w:p>
+    <w:p>
+      <w:pPr>
+        <w:ind w:left="420" w:hanging="220"/>
+      </w:pPr>
+      <w:r>
+        <w:t xml:space="preserve">•  </w:t>
+      </w:r>
+      <w:r>
+        <w:rPr>
+          <w:b/>
+        </w:rPr>
+        <w:t xml:space="preserve">Ad status</w:t>
+      </w:r>
+      <w:r>
+        <w:t xml:space="preserve"> — </w:t>
+      </w:r>
+      <w:r>
+        <w:rPr>
+          <w:rFonts w:ascii="Consolas" w:hAnsi="Consolas" w:cs="Consolas"/>
+        </w:rPr>
+        <w:t xml:space="preserve">active</w:t>
+      </w:r>
+      <w:r>
+        <w:t xml:space="preserve"> / </w:t>
+      </w:r>
+      <w:r>
+        <w:rPr>
+          <w:rFonts w:ascii="Consolas" w:hAnsi="Consolas" w:cs="Consolas"/>
+        </w:rPr>
+        <w:t xml:space="preserve">paused</w:t>
+      </w:r>
+      <w:r>
+        <w:t xml:space="preserve">; ads carry </w:t>
+      </w:r>
+      <w:r>
+        <w:rPr>
+          <w:rFonts w:ascii="Consolas" w:hAnsi="Consolas" w:cs="Consolas"/>
+        </w:rPr>
+        <w:t xml:space="preserve">clubId</w:t>
+      </w:r>
+      <w:r>
+        <w:t xml:space="preserve">, </w:t>
+      </w:r>
+      <w:r>
+        <w:rPr>
+          <w:rFonts w:ascii="Consolas" w:hAnsi="Consolas" w:cs="Consolas"/>
+        </w:rPr>
+        <w:t xml:space="preserve">title</w:t>
+      </w:r>
+      <w:r>
+        <w:t xml:space="preserve">, </w:t>
+      </w:r>
+      <w:r>
+        <w:rPr>
+          <w:rFonts w:ascii="Consolas" w:hAnsi="Consolas" w:cs="Consolas"/>
+        </w:rPr>
+        <w:t xml:space="preserve">tagline</w:t>
+      </w:r>
+      <w:r>
+        <w:t xml:space="preserve">, </w:t>
+      </w:r>
+      <w:r>
+        <w:rPr>
+          <w:rFonts w:ascii="Consolas" w:hAnsi="Consolas" w:cs="Consolas"/>
+        </w:rPr>
+        <w:t xml:space="preserve">media</w:t>
+      </w:r>
+      <w:r>
+        <w:t xml:space="preserve">, </w:t>
+      </w:r>
+      <w:r>
+        <w:rPr>
+          <w:rFonts w:ascii="Consolas" w:hAnsi="Consolas" w:cs="Consolas"/>
+        </w:rPr>
+        <w:t xml:space="preserve">mediaType</w:t>
+      </w:r>
+      <w:r>
+        <w:t xml:space="preserve"> (image/video) and a </w:t>
+      </w:r>
+      <w:r>
+        <w:rPr>
+          <w:rFonts w:ascii="Consolas" w:hAnsi="Consolas" w:cs="Consolas"/>
+        </w:rPr>
+        <w:t xml:space="preserve">link</w:t>
+      </w:r>
+      <w:r>
+        <w:t xml:space="preserve"> target.</w:t>
+      </w:r>
+    </w:p>
+    <w:p>
+      <w:pPr>
+        <w:ind w:left="420" w:hanging="220"/>
+      </w:pPr>
+      <w:r>
+        <w:t xml:space="preserve">•  </w:t>
+      </w:r>
+      <w:r>
+        <w:rPr>
+          <w:b/>
+        </w:rPr>
         <w:t xml:space="preserve">Submissions</w:t>
       </w:r>
       <w:r>
@@ -5103,7 +6301,34 @@
         <w:t xml:space="preserve">executives</w:t>
       </w:r>
       <w:r>
-        <w:t xml:space="preserve"> collections, plus public storage buckets for event banners, gallery photos and notice attachments. It also includes MCP server configs so AI assistants and IDEs can operate the backend directly. See </w:t>
+        <w:t xml:space="preserve"> collections, plus public storage buckets for event banners, gallery photos and notice attachments. </w:t>
+      </w:r>
+      <w:r>
+        <w:rPr>
+          <w:rFonts w:ascii="Consolas" w:hAnsi="Consolas" w:cs="Consolas"/>
+        </w:rPr>
+        <w:t xml:space="preserve">appwrite/seed-students.mjs</w:t>
+      </w:r>
+      <w:r>
+        <w:t xml:space="preserve"> seeds the </w:t>
+      </w:r>
+      <w:r>
+        <w:rPr>
+          <w:rFonts w:ascii="Consolas" w:hAnsi="Consolas" w:cs="Consolas"/>
+        </w:rPr>
+        <w:t xml:space="preserve">students</w:t>
+      </w:r>
+      <w:r>
+        <w:t xml:space="preserve"> collection used by the student directory, and </w:t>
+      </w:r>
+      <w:r>
+        <w:rPr>
+          <w:rFonts w:ascii="Consolas" w:hAnsi="Consolas" w:cs="Consolas"/>
+        </w:rPr>
+        <w:t xml:space="preserve">appwrite/seed-site-data.mjs</w:t>
+      </w:r>
+      <w:r>
+        <w:t xml:space="preserve"> seeds clubs/notices/forms/events. The kit also includes MCP server configs so AI assistants and IDEs can operate the backend directly. See </w:t>
       </w:r>
       <w:r>
         <w:rPr>
@@ -5538,6 +6763,24 @@
               <w:t xml:space="preserve">npm run setup            # creates database, collections, indexes and buckets (idempotent)</w:t>
             </w:r>
           </w:p>
+          <w:p>
+            <w:pPr>
+              <w:pStyle w:val="Code"/>
+              <w:spacing w:after="0" w:line="240" w:lineRule="auto"/>
+            </w:pPr>
+            <w:r>
+              <w:t xml:space="preserve">npm run seed:students    # seeds the student roster (powers the directory)</w:t>
+            </w:r>
+          </w:p>
+          <w:p>
+            <w:pPr>
+              <w:pStyle w:val="Code"/>
+              <w:spacing w:after="0" w:line="240" w:lineRule="auto"/>
+            </w:pPr>
+            <w:r>
+              <w:t xml:space="preserve">npm run seed:site        # seeds clubs, notices, forms and events</w:t>
+            </w:r>
+          </w:p>
         </w:tc>
       </w:tr>
     </w:tbl>
@@ -5547,55 +6790,26 @@
       </w:pPr>
     </w:p>
     <w:p>
-      <w:pPr>
-        <w:pStyle w:val="Heading2"/>
-      </w:pPr>
-      <w:r>
-        <w:t xml:space="preserve">7.6 Demo Mode</w:t>
-      </w:r>
-    </w:p>
-    <w:p>
-      <w:r>
-        <w:t xml:space="preserve">With no Firebase config, the member portal uses the demo member code </w:t>
-      </w:r>
-      <w:r>
-        <w:rPr>
-          <w:rFonts w:ascii="Consolas" w:hAnsi="Consolas" w:cs="Consolas"/>
-        </w:rPr>
-        <w:t xml:space="preserve">niter2025</w:t>
-      </w:r>
-      <w:r>
-        <w:t xml:space="preserve"> and stores everything locally — ideal for evaluation and development.</w:t>
-      </w:r>
-    </w:p>
-    <w:p>
-      <w:pPr>
-        <w:pStyle w:val="Heading1"/>
-      </w:pPr>
-      <w:r>
-        <w:t xml:space="preserve">8. Deployment</w:t>
-      </w:r>
-    </w:p>
-    <w:p>
-      <w:pPr>
-        <w:pStyle w:val="Heading2"/>
-      </w:pPr>
-      <w:r>
-        <w:t xml:space="preserve">8.1 Firebase Hosting (Legacy App)</w:t>
-      </w:r>
-    </w:p>
-    <w:p>
-      <w:r>
-        <w:t xml:space="preserve">The static app can be hosted anywhere — Firebase Hosting, GitHub Pages, Netlify, or even opened locally, since the Firebase SDK works from </w:t>
-      </w:r>
-      <w:r>
-        <w:rPr>
-          <w:rFonts w:ascii="Consolas" w:hAnsi="Consolas" w:cs="Consolas"/>
-        </w:rPr>
-        <w:t xml:space="preserve">file://</w:t>
-      </w:r>
-      <w:r>
-        <w:t xml:space="preserve">. To deploy on Firebase Hosting:</w:t>
+      <w:r>
+        <w:t xml:space="preserve">To use the student directory and the Appwrite mirror in the web app, copy the three values into </w:t>
+      </w:r>
+      <w:r>
+        <w:rPr>
+          <w:rFonts w:ascii="Consolas" w:hAnsi="Consolas" w:cs="Consolas"/>
+        </w:rPr>
+        <w:t xml:space="preserve">web/.env.local</w:t>
+      </w:r>
+      <w:r>
+        <w:t xml:space="preserve"> (see </w:t>
+      </w:r>
+      <w:r>
+        <w:rPr>
+          <w:rFonts w:ascii="Consolas" w:hAnsi="Consolas" w:cs="Consolas"/>
+        </w:rPr>
+        <w:t xml:space="preserve">appwrite/README.md</w:t>
+      </w:r>
+      <w:r>
+        <w:t xml:space="preserve">):</w:t>
       </w:r>
     </w:p>
     <w:tbl>
@@ -5631,7 +6845,7 @@
               <w:spacing w:after="0" w:line="240" w:lineRule="auto"/>
             </w:pPr>
             <w:r>
-              <w:t xml:space="preserve">cd firebase</w:t>
+              <w:t xml:space="preserve">APPWRITE_ENDPOINT=https://sgp.cloud.appwrite.io/v1</w:t>
             </w:r>
           </w:p>
           <w:p>
@@ -5640,7 +6854,7 @@
               <w:spacing w:after="0" w:line="240" w:lineRule="auto"/>
             </w:pPr>
             <w:r>
-              <w:t xml:space="preserve">firebase init hosting    # point "public" at the project root (one level up)</w:t>
+              <w:t xml:space="preserve">APPWRITE_PROJECT_ID=…</w:t>
             </w:r>
           </w:p>
           <w:p>
@@ -5649,7 +6863,7 @@
               <w:spacing w:after="0" w:line="240" w:lineRule="auto"/>
             </w:pPr>
             <w:r>
-              <w:t xml:space="preserve">firebase deploy --only hosting</w:t>
+              <w:t xml:space="preserve">APPWRITE_API_KEY=…          # server key with databases.read — never sent to the browser</w:t>
             </w:r>
           </w:p>
         </w:tc>
@@ -5665,7 +6879,51 @@
         <w:pStyle w:val="Heading2"/>
       </w:pPr>
       <w:r>
-        <w:t xml:space="preserve">8.2 Next.js App</w:t>
+        <w:t xml:space="preserve">7.6 Demo Mode</w:t>
+      </w:r>
+    </w:p>
+    <w:p>
+      <w:r>
+        <w:t xml:space="preserve">With no Firebase config, the member portal uses the demo member code </w:t>
+      </w:r>
+      <w:r>
+        <w:rPr>
+          <w:rFonts w:ascii="Consolas" w:hAnsi="Consolas" w:cs="Consolas"/>
+        </w:rPr>
+        <w:t xml:space="preserve">niter2025</w:t>
+      </w:r>
+      <w:r>
+        <w:t xml:space="preserve"> and stores everything locally — ideal for evaluation and development.</w:t>
+      </w:r>
+    </w:p>
+    <w:p>
+      <w:pPr>
+        <w:pStyle w:val="Heading1"/>
+      </w:pPr>
+      <w:r>
+        <w:t xml:space="preserve">8. Deployment</w:t>
+      </w:r>
+    </w:p>
+    <w:p>
+      <w:pPr>
+        <w:pStyle w:val="Heading2"/>
+      </w:pPr>
+      <w:r>
+        <w:t xml:space="preserve">8.1 Firebase Hosting (Legacy App)</w:t>
+      </w:r>
+    </w:p>
+    <w:p>
+      <w:r>
+        <w:t xml:space="preserve">The static app can be hosted anywhere — Firebase Hosting, GitHub Pages, Netlify, or even opened locally, since the Firebase SDK works from </w:t>
+      </w:r>
+      <w:r>
+        <w:rPr>
+          <w:rFonts w:ascii="Consolas" w:hAnsi="Consolas" w:cs="Consolas"/>
+        </w:rPr>
+        <w:t xml:space="preserve">file://</w:t>
+      </w:r>
+      <w:r>
+        <w:t xml:space="preserve">. To deploy on Firebase Hosting:</w:t>
       </w:r>
     </w:p>
     <w:tbl>
@@ -5701,7 +6959,7 @@
               <w:spacing w:after="0" w:line="240" w:lineRule="auto"/>
             </w:pPr>
             <w:r>
-              <w:t xml:space="preserve">cd web</w:t>
+              <w:t xml:space="preserve">cd firebase</w:t>
             </w:r>
           </w:p>
           <w:p>
@@ -5710,7 +6968,7 @@
               <w:spacing w:after="0" w:line="240" w:lineRule="auto"/>
             </w:pPr>
             <w:r>
-              <w:t xml:space="preserve">npm run build</w:t>
+              <w:t xml:space="preserve">firebase init hosting    # point "public" at the project root (one level up)</w:t>
             </w:r>
           </w:p>
           <w:p>
@@ -5719,7 +6977,7 @@
               <w:spacing w:after="0" w:line="240" w:lineRule="auto"/>
             </w:pPr>
             <w:r>
-              <w:t xml:space="preserve">npm start                # production server (default http://localhost:3000)</w:t>
+              <w:t xml:space="preserve">firebase deploy --only hosting</w:t>
             </w:r>
           </w:p>
         </w:tc>
@@ -5731,366 +6989,11 @@
       </w:pPr>
     </w:p>
     <w:p>
-      <w:r>
-        <w:t xml:space="preserve">The Next.js app includes </w:t>
-      </w:r>
-      <w:r>
-        <w:rPr>
-          <w:rFonts w:ascii="Consolas" w:hAnsi="Consolas" w:cs="Consolas"/>
-        </w:rPr>
-        <w:t xml:space="preserve">robots.ts</w:t>
-      </w:r>
-      <w:r>
-        <w:t xml:space="preserve">, </w:t>
-      </w:r>
-      <w:r>
-        <w:rPr>
-          <w:rFonts w:ascii="Consolas" w:hAnsi="Consolas" w:cs="Consolas"/>
-        </w:rPr>
-        <w:t xml:space="preserve">sitemap.ts</w:t>
-      </w:r>
-      <w:r>
-        <w:t xml:space="preserve">, </w:t>
-      </w:r>
-      <w:r>
-        <w:rPr>
-          <w:rFonts w:ascii="Consolas" w:hAnsi="Consolas" w:cs="Consolas"/>
-        </w:rPr>
-        <w:t xml:space="preserve">manifest.ts</w:t>
-      </w:r>
-      <w:r>
-        <w:t xml:space="preserve"> and OpenGraph/JSON-LD metadata for search and social sharing.</w:t>
-      </w:r>
-    </w:p>
-    <w:p>
       <w:pPr>
         <w:pStyle w:val="Heading2"/>
       </w:pPr>
       <w:r>
-        <w:t xml:space="preserve">8.3 Continuous Integration</w:t>
-      </w:r>
-    </w:p>
-    <w:p>
-      <w:r>
-        <w:t xml:space="preserve">GitHub Actions (</w:t>
-      </w:r>
-      <w:r>
-        <w:rPr>
-          <w:rFonts w:ascii="Consolas" w:hAnsi="Consolas" w:cs="Consolas"/>
-        </w:rPr>
-        <w:t xml:space="preserve">.github/workflows/ci.yml</w:t>
-      </w:r>
-      <w:r>
-        <w:t xml:space="preserve">) runs typecheck, lint, format check and a production build on every push, guarding the </w:t>
-      </w:r>
-      <w:r>
-        <w:rPr>
-          <w:rFonts w:ascii="Consolas" w:hAnsi="Consolas" w:cs="Consolas"/>
-        </w:rPr>
-        <w:t xml:space="preserve">main</w:t>
-      </w:r>
-      <w:r>
-        <w:t xml:space="preserve"> branch.</w:t>
-      </w:r>
-    </w:p>
-    <w:p>
-      <w:pPr>
-        <w:pStyle w:val="Heading2"/>
-      </w:pPr>
-      <w:r>
-        <w:t xml:space="preserve">8.4 Environment Configuration</w:t>
-      </w:r>
-    </w:p>
-    <w:p>
-      <w:r>
-        <w:t xml:space="preserve">The Firebase configuration defaults to the live </w:t>
-      </w:r>
-      <w:r>
-        <w:rPr>
-          <w:rFonts w:ascii="Consolas" w:hAnsi="Consolas" w:cs="Consolas"/>
-        </w:rPr>
-        <w:t xml:space="preserve">niter-club-website</w:t>
-      </w:r>
-      <w:r>
-        <w:t xml:space="preserve"> project; the </w:t>
-      </w:r>
-      <w:r>
-        <w:rPr>
-          <w:rFonts w:ascii="Consolas" w:hAnsi="Consolas" w:cs="Consolas"/>
-        </w:rPr>
-        <w:t xml:space="preserve">apiKey</w:t>
-      </w:r>
-      <w:r>
-        <w:t xml:space="preserve"> is public by design — security lives in the Firestore rules, not in the key. To point at another project, copy </w:t>
-      </w:r>
-      <w:r>
-        <w:rPr>
-          <w:rFonts w:ascii="Consolas" w:hAnsi="Consolas" w:cs="Consolas"/>
-        </w:rPr>
-        <w:t xml:space="preserve">web/.env.example</w:t>
-      </w:r>
-      <w:r>
-        <w:t xml:space="preserve"> to </w:t>
-      </w:r>
-      <w:r>
-        <w:rPr>
-          <w:rFonts w:ascii="Consolas" w:hAnsi="Consolas" w:cs="Consolas"/>
-        </w:rPr>
-        <w:t xml:space="preserve">web/.env.local</w:t>
-      </w:r>
-      <w:r>
-        <w:t xml:space="preserve"> and fill in the values.</w:t>
-      </w:r>
-    </w:p>
-    <w:p>
-      <w:pPr>
-        <w:pStyle w:val="Heading1"/>
-      </w:pPr>
-      <w:r>
-        <w:t xml:space="preserve">9. Security Model</w:t>
-      </w:r>
-    </w:p>
-    <w:p>
-      <w:pPr>
-        <w:pStyle w:val="Heading2"/>
-      </w:pPr>
-      <w:r>
-        <w:t xml:space="preserve">9.1 Firestore Rules</w:t>
-      </w:r>
-    </w:p>
-    <w:p>
-      <w:r>
-        <w:t xml:space="preserve">The rules in </w:t>
-      </w:r>
-      <w:r>
-        <w:rPr>
-          <w:rFonts w:ascii="Consolas" w:hAnsi="Consolas" w:cs="Consolas"/>
-        </w:rPr>
-        <w:t xml:space="preserve">firebase/firestore.rules</w:t>
-      </w:r>
-      <w:r>
-        <w:t xml:space="preserve"> enforce the read/write matrix in §6.1 server-side — a client can never grant itself access by editing the UI. Key protections:</w:t>
-      </w:r>
-    </w:p>
-    <w:p>
-      <w:pPr>
-        <w:ind w:left="420" w:hanging="220"/>
-      </w:pPr>
-      <w:r>
-        <w:t xml:space="preserve">•  </w:t>
-      </w:r>
-      <w:r>
-        <w:t xml:space="preserve">Public collections (</w:t>
-      </w:r>
-      <w:r>
-        <w:rPr>
-          <w:rFonts w:ascii="Consolas" w:hAnsi="Consolas" w:cs="Consolas"/>
-        </w:rPr>
-        <w:t xml:space="preserve">clubs</w:t>
-      </w:r>
-      <w:r>
-        <w:t xml:space="preserve">, </w:t>
-      </w:r>
-      <w:r>
-        <w:rPr>
-          <w:rFonts w:ascii="Consolas" w:hAnsi="Consolas" w:cs="Consolas"/>
-        </w:rPr>
-        <w:t xml:space="preserve">notices</w:t>
-      </w:r>
-      <w:r>
-        <w:t xml:space="preserve">, </w:t>
-      </w:r>
-      <w:r>
-        <w:rPr>
-          <w:rFonts w:ascii="Consolas" w:hAnsi="Consolas" w:cs="Consolas"/>
-        </w:rPr>
-        <w:t xml:space="preserve">forms</w:t>
-      </w:r>
-      <w:r>
-        <w:t xml:space="preserve">) are readable by anyone but writable only by the club's admins/executives.</w:t>
-      </w:r>
-    </w:p>
-    <w:p>
-      <w:pPr>
-        <w:ind w:left="420" w:hanging="220"/>
-      </w:pPr>
-      <w:r>
-        <w:t xml:space="preserve">•  </w:t>
-      </w:r>
-      <w:r>
-        <w:t xml:space="preserve">Restricted collections (</w:t>
-      </w:r>
-      <w:r>
-        <w:rPr>
-          <w:rFonts w:ascii="Consolas" w:hAnsi="Consolas" w:cs="Consolas"/>
-        </w:rPr>
-        <w:t xml:space="preserve">submissions</w:t>
-      </w:r>
-      <w:r>
-        <w:t xml:space="preserve">, </w:t>
-      </w:r>
-      <w:r>
-        <w:rPr>
-          <w:rFonts w:ascii="Consolas" w:hAnsi="Consolas" w:cs="Consolas"/>
-        </w:rPr>
-        <w:t xml:space="preserve">complaints</w:t>
-      </w:r>
-      <w:r>
-        <w:t xml:space="preserve">) are readable only by club staff and scoped by club.</w:t>
-      </w:r>
-    </w:p>
-    <w:p>
-      <w:pPr>
-        <w:ind w:left="420" w:hanging="220"/>
-      </w:pPr>
-      <w:r>
-        <w:t xml:space="preserve">•  </w:t>
-      </w:r>
-      <w:r>
-        <w:rPr>
-          <w:rFonts w:ascii="Consolas" w:hAnsi="Consolas" w:cs="Consolas"/>
-        </w:rPr>
-        <w:t xml:space="preserve">users/{uid}</w:t>
-      </w:r>
-      <w:r>
-        <w:t xml:space="preserve"> documents are writable by the owner (name only) and by admins (roles).</w:t>
-      </w:r>
-    </w:p>
-    <w:p>
-      <w:pPr>
-        <w:ind w:left="420" w:hanging="220"/>
-      </w:pPr>
-      <w:r>
-        <w:t xml:space="preserve">•  </w:t>
-      </w:r>
-      <w:r>
-        <w:t xml:space="preserve">The </w:t>
-      </w:r>
-      <w:r>
-        <w:rPr>
-          <w:rFonts w:ascii="Consolas" w:hAnsi="Consolas" w:cs="Consolas"/>
-        </w:rPr>
-        <w:t xml:space="preserve">meta/bootstrap</w:t>
-      </w:r>
-      <w:r>
-        <w:t xml:space="preserve"> marker ensures the first admin account is created exactly once.</w:t>
-      </w:r>
-    </w:p>
-    <w:p>
-      <w:pPr>
-        <w:pStyle w:val="Heading2"/>
-      </w:pPr>
-      <w:r>
-        <w:t xml:space="preserve">9.2 Storage Rules</w:t>
-      </w:r>
-    </w:p>
-    <w:p>
-      <w:r>
-        <w:rPr>
-          <w:rFonts w:ascii="Consolas" w:hAnsi="Consolas" w:cs="Consolas"/>
-        </w:rPr>
-        <w:t xml:space="preserve">firebase/storage.rules</w:t>
-      </w:r>
-      <w:r>
-        <w:t xml:space="preserve"> restrict uploads to </w:t>
-      </w:r>
-      <w:r>
-        <w:rPr>
-          <w:rFonts w:ascii="Consolas" w:hAnsi="Consolas" w:cs="Consolas"/>
-        </w:rPr>
-        <w:t xml:space="preserve">submission-photos/</w:t>
-      </w:r>
-      <w:r>
-        <w:t xml:space="preserve"> paths; signed-in users write under their own </w:t>
-      </w:r>
-      <w:r>
-        <w:rPr>
-          <w:rFonts w:ascii="Consolas" w:hAnsi="Consolas" w:cs="Consolas"/>
-        </w:rPr>
-        <w:t xml:space="preserve">uid</w:t>
-      </w:r>
-      <w:r>
-        <w:t xml:space="preserve"> folder while anonymous visitors write under </w:t>
-      </w:r>
-      <w:r>
-        <w:rPr>
-          <w:rFonts w:ascii="Consolas" w:hAnsi="Consolas" w:cs="Consolas"/>
-        </w:rPr>
-        <w:t xml:space="preserve">guest/</w:t>
-      </w:r>
-      <w:r>
-        <w:t xml:space="preserve">. Files are validated as images client-side (type and ≤ 8 MB) before upload.</w:t>
-      </w:r>
-    </w:p>
-    <w:p>
-      <w:pPr>
-        <w:pStyle w:val="Heading2"/>
-      </w:pPr>
-      <w:r>
-        <w:t xml:space="preserve">9.3 Data Privacy</w:t>
-      </w:r>
-    </w:p>
-    <w:p>
-      <w:r>
-        <w:t xml:space="preserve">Student personal data — student IDs, phone numbers, photos, application details — is never exposed publicly. Only the club's staff can read submissions and complaints for their club.</w:t>
-      </w:r>
-    </w:p>
-    <w:p>
-      <w:pPr>
-        <w:pStyle w:val="Heading2"/>
-      </w:pPr>
-      <w:r>
-        <w:t xml:space="preserve">9.4 Platform Notes</w:t>
-      </w:r>
-    </w:p>
-    <w:p>
-      <w:pPr>
-        <w:ind w:left="420" w:hanging="220"/>
-      </w:pPr>
-      <w:r>
-        <w:t xml:space="preserve">•  </w:t>
-      </w:r>
-      <w:r>
-        <w:t xml:space="preserve">Passwords are handled entirely by Firebase Auth — they are never stored or logged in the application.</w:t>
-      </w:r>
-    </w:p>
-    <w:p>
-      <w:pPr>
-        <w:ind w:left="420" w:hanging="220"/>
-      </w:pPr>
-      <w:r>
-        <w:t xml:space="preserve">•  </w:t>
-      </w:r>
-      <w:r>
-        <w:t xml:space="preserve">Role checks are re-verified from the user's Firestore profile on every restricted read, so revoking a role takes effect immediately.</w:t>
-      </w:r>
-    </w:p>
-    <w:p>
-      <w:pPr>
-        <w:ind w:left="420" w:hanging="220"/>
-      </w:pPr>
-      <w:r>
-        <w:t xml:space="preserve">•  </w:t>
-      </w:r>
-      <w:r>
-        <w:t xml:space="preserve">The Appwrite variant (if used) keeps server-side API keys in </w:t>
-      </w:r>
-      <w:r>
-        <w:rPr>
-          <w:rFonts w:ascii="Consolas" w:hAnsi="Consolas" w:cs="Consolas"/>
-        </w:rPr>
-        <w:t xml:space="preserve">.env</w:t>
-      </w:r>
-      <w:r>
-        <w:t xml:space="preserve"> (gitignored) and enforces roles in the backend.</w:t>
-      </w:r>
-    </w:p>
-    <w:p>
-      <w:pPr>
-        <w:pStyle w:val="Heading1"/>
-      </w:pPr>
-      <w:r>
-        <w:t xml:space="preserve">10. Project Structure</w:t>
+        <w:t xml:space="preserve">8.2 Next.js App</w:t>
       </w:r>
     </w:p>
     <w:tbl>
@@ -6126,7 +7029,7 @@
               <w:spacing w:after="0" w:line="240" w:lineRule="auto"/>
             </w:pPr>
             <w:r>
-              <w:t xml:space="preserve">NITER-CLUB-WEBSITE/</w:t>
+              <w:t xml:space="preserve">cd web</w:t>
             </w:r>
           </w:p>
           <w:p>
@@ -6135,7 +7038,7 @@
               <w:spacing w:after="0" w:line="240" w:lineRule="auto"/>
             </w:pPr>
             <w:r>
-              <w:t xml:space="preserve">├── index.html              # Legacy static SPA (Firebase, offline-capable)</w:t>
+              <w:t xml:space="preserve">npm run build</w:t>
             </w:r>
           </w:p>
           <w:p>
@@ -6144,16 +7047,490 @@
               <w:spacing w:after="0" w:line="240" w:lineRule="auto"/>
             </w:pPr>
             <w:r>
-              <w:t xml:space="preserve">├── css/styles.css          # Legacy stylesheet</w:t>
-            </w:r>
-          </w:p>
+              <w:t xml:space="preserve">npm start                # production server (default http://localhost:3000)</w:t>
+            </w:r>
+          </w:p>
+        </w:tc>
+      </w:tr>
+    </w:tbl>
+    <w:p>
+      <w:pPr>
+        <w:spacing w:after="120"/>
+      </w:pPr>
+    </w:p>
+    <w:p>
+      <w:r>
+        <w:t xml:space="preserve">The Next.js app includes </w:t>
+      </w:r>
+      <w:r>
+        <w:rPr>
+          <w:rFonts w:ascii="Consolas" w:hAnsi="Consolas" w:cs="Consolas"/>
+        </w:rPr>
+        <w:t xml:space="preserve">robots.ts</w:t>
+      </w:r>
+      <w:r>
+        <w:t xml:space="preserve">, </w:t>
+      </w:r>
+      <w:r>
+        <w:rPr>
+          <w:rFonts w:ascii="Consolas" w:hAnsi="Consolas" w:cs="Consolas"/>
+        </w:rPr>
+        <w:t xml:space="preserve">sitemap.ts</w:t>
+      </w:r>
+      <w:r>
+        <w:t xml:space="preserve">, </w:t>
+      </w:r>
+      <w:r>
+        <w:rPr>
+          <w:rFonts w:ascii="Consolas" w:hAnsi="Consolas" w:cs="Consolas"/>
+        </w:rPr>
+        <w:t xml:space="preserve">manifest.ts</w:t>
+      </w:r>
+      <w:r>
+        <w:t xml:space="preserve"> and OpenGraph/JSON-LD metadata for search and social sharing.</w:t>
+      </w:r>
+    </w:p>
+    <w:p>
+      <w:pPr>
+        <w:pStyle w:val="Heading2"/>
+      </w:pPr>
+      <w:r>
+        <w:t xml:space="preserve">8.3 Continuous Integration</w:t>
+      </w:r>
+    </w:p>
+    <w:p>
+      <w:r>
+        <w:t xml:space="preserve">GitHub Actions (</w:t>
+      </w:r>
+      <w:r>
+        <w:rPr>
+          <w:rFonts w:ascii="Consolas" w:hAnsi="Consolas" w:cs="Consolas"/>
+        </w:rPr>
+        <w:t xml:space="preserve">.github/workflows/ci.yml</w:t>
+      </w:r>
+      <w:r>
+        <w:t xml:space="preserve">) runs typecheck, lint, format check and a production build on every push, guarding the </w:t>
+      </w:r>
+      <w:r>
+        <w:rPr>
+          <w:rFonts w:ascii="Consolas" w:hAnsi="Consolas" w:cs="Consolas"/>
+        </w:rPr>
+        <w:t xml:space="preserve">main</w:t>
+      </w:r>
+      <w:r>
+        <w:t xml:space="preserve"> branch.</w:t>
+      </w:r>
+    </w:p>
+    <w:p>
+      <w:pPr>
+        <w:pStyle w:val="Heading2"/>
+      </w:pPr>
+      <w:r>
+        <w:t xml:space="preserve">8.4 Environment Configuration</w:t>
+      </w:r>
+    </w:p>
+    <w:p>
+      <w:r>
+        <w:t xml:space="preserve">The Firebase configuration defaults to the live </w:t>
+      </w:r>
+      <w:r>
+        <w:rPr>
+          <w:rFonts w:ascii="Consolas" w:hAnsi="Consolas" w:cs="Consolas"/>
+        </w:rPr>
+        <w:t xml:space="preserve">niter-club-website</w:t>
+      </w:r>
+      <w:r>
+        <w:t xml:space="preserve"> project; the </w:t>
+      </w:r>
+      <w:r>
+        <w:rPr>
+          <w:rFonts w:ascii="Consolas" w:hAnsi="Consolas" w:cs="Consolas"/>
+        </w:rPr>
+        <w:t xml:space="preserve">apiKey</w:t>
+      </w:r>
+      <w:r>
+        <w:t xml:space="preserve"> is public by design — security lives in the Firestore rules, not in the key. To point at another project, copy </w:t>
+      </w:r>
+      <w:r>
+        <w:rPr>
+          <w:rFonts w:ascii="Consolas" w:hAnsi="Consolas" w:cs="Consolas"/>
+        </w:rPr>
+        <w:t xml:space="preserve">web/.env.example</w:t>
+      </w:r>
+      <w:r>
+        <w:t xml:space="preserve"> to </w:t>
+      </w:r>
+      <w:r>
+        <w:rPr>
+          <w:rFonts w:ascii="Consolas" w:hAnsi="Consolas" w:cs="Consolas"/>
+        </w:rPr>
+        <w:t xml:space="preserve">web/.env.local</w:t>
+      </w:r>
+      <w:r>
+        <w:t xml:space="preserve"> and fill in the values.</w:t>
+      </w:r>
+    </w:p>
+    <w:p>
+      <w:pPr>
+        <w:pStyle w:val="Heading1"/>
+      </w:pPr>
+      <w:r>
+        <w:t xml:space="preserve">9. Security Model</w:t>
+      </w:r>
+    </w:p>
+    <w:p>
+      <w:pPr>
+        <w:pStyle w:val="Heading2"/>
+      </w:pPr>
+      <w:r>
+        <w:t xml:space="preserve">9.1 Firestore Rules</w:t>
+      </w:r>
+    </w:p>
+    <w:p>
+      <w:r>
+        <w:t xml:space="preserve">The rules in </w:t>
+      </w:r>
+      <w:r>
+        <w:rPr>
+          <w:rFonts w:ascii="Consolas" w:hAnsi="Consolas" w:cs="Consolas"/>
+        </w:rPr>
+        <w:t xml:space="preserve">firebase/firestore.rules</w:t>
+      </w:r>
+      <w:r>
+        <w:t xml:space="preserve"> enforce the read/write matrix in §6.1 server-side — a client can never grant itself access by editing the UI. Key protections:</w:t>
+      </w:r>
+    </w:p>
+    <w:p>
+      <w:pPr>
+        <w:ind w:left="420" w:hanging="220"/>
+      </w:pPr>
+      <w:r>
+        <w:t xml:space="preserve">•  </w:t>
+      </w:r>
+      <w:r>
+        <w:t xml:space="preserve">Public collections (</w:t>
+      </w:r>
+      <w:r>
+        <w:rPr>
+          <w:rFonts w:ascii="Consolas" w:hAnsi="Consolas" w:cs="Consolas"/>
+        </w:rPr>
+        <w:t xml:space="preserve">clubs</w:t>
+      </w:r>
+      <w:r>
+        <w:t xml:space="preserve">, </w:t>
+      </w:r>
+      <w:r>
+        <w:rPr>
+          <w:rFonts w:ascii="Consolas" w:hAnsi="Consolas" w:cs="Consolas"/>
+        </w:rPr>
+        <w:t xml:space="preserve">notices</w:t>
+      </w:r>
+      <w:r>
+        <w:t xml:space="preserve">, </w:t>
+      </w:r>
+      <w:r>
+        <w:rPr>
+          <w:rFonts w:ascii="Consolas" w:hAnsi="Consolas" w:cs="Consolas"/>
+        </w:rPr>
+        <w:t xml:space="preserve">forms</w:t>
+      </w:r>
+      <w:r>
+        <w:t xml:space="preserve">, </w:t>
+      </w:r>
+      <w:r>
+        <w:rPr>
+          <w:rFonts w:ascii="Consolas" w:hAnsi="Consolas" w:cs="Consolas"/>
+        </w:rPr>
+        <w:t xml:space="preserve">events</w:t>
+      </w:r>
+      <w:r>
+        <w:t xml:space="preserve">, </w:t>
+      </w:r>
+      <w:r>
+        <w:rPr>
+          <w:rFonts w:ascii="Consolas" w:hAnsi="Consolas" w:cs="Consolas"/>
+        </w:rPr>
+        <w:t xml:space="preserve">ads</w:t>
+      </w:r>
+      <w:r>
+        <w:t xml:space="preserve">) are readable by anyone but writable only by the club's admins/executives.</w:t>
+      </w:r>
+    </w:p>
+    <w:p>
+      <w:pPr>
+        <w:ind w:left="420" w:hanging="220"/>
+      </w:pPr>
+      <w:r>
+        <w:t xml:space="preserve">•  </w:t>
+      </w:r>
+      <w:r>
+        <w:t xml:space="preserve">Restricted collections (</w:t>
+      </w:r>
+      <w:r>
+        <w:rPr>
+          <w:rFonts w:ascii="Consolas" w:hAnsi="Consolas" w:cs="Consolas"/>
+        </w:rPr>
+        <w:t xml:space="preserve">submissions</w:t>
+      </w:r>
+      <w:r>
+        <w:t xml:space="preserve">, </w:t>
+      </w:r>
+      <w:r>
+        <w:rPr>
+          <w:rFonts w:ascii="Consolas" w:hAnsi="Consolas" w:cs="Consolas"/>
+        </w:rPr>
+        <w:t xml:space="preserve">complaints</w:t>
+      </w:r>
+      <w:r>
+        <w:t xml:space="preserve">, </w:t>
+      </w:r>
+      <w:r>
+        <w:rPr>
+          <w:rFonts w:ascii="Consolas" w:hAnsi="Consolas" w:cs="Consolas"/>
+        </w:rPr>
+        <w:t xml:space="preserve">memberships</w:t>
+      </w:r>
+      <w:r>
+        <w:t xml:space="preserve">) are readable only by club staff and scoped by club.</w:t>
+      </w:r>
+    </w:p>
+    <w:p>
+      <w:pPr>
+        <w:ind w:left="420" w:hanging="220"/>
+      </w:pPr>
+      <w:r>
+        <w:t xml:space="preserve">•  </w:t>
+      </w:r>
+      <w:r>
+        <w:t xml:space="preserve">The ads and committee editors are double-guarded in code (</w:t>
+      </w:r>
+      <w:r>
+        <w:rPr>
+          <w:rFonts w:ascii="Consolas" w:hAnsi="Consolas" w:cs="Consolas"/>
+        </w:rPr>
+        <w:t xml:space="preserve">canManageClub</w:t>
+      </w:r>
+      <w:r>
+        <w:t xml:space="preserve"> / </w:t>
+      </w:r>
+      <w:r>
+        <w:rPr>
+          <w:rFonts w:ascii="Consolas" w:hAnsi="Consolas" w:cs="Consolas"/>
+        </w:rPr>
+        <w:t xml:space="preserve">isPortalAdmin</w:t>
+      </w:r>
+      <w:r>
+        <w:t xml:space="preserve">), so a moderator can only touch their own club's content.</w:t>
+      </w:r>
+    </w:p>
+    <w:p>
+      <w:pPr>
+        <w:ind w:left="420" w:hanging="220"/>
+      </w:pPr>
+      <w:r>
+        <w:t xml:space="preserve">•  </w:t>
+      </w:r>
+      <w:r>
+        <w:t xml:space="preserve">The student directory is hidden from the public navigation and gated to portal admins.</w:t>
+      </w:r>
+    </w:p>
+    <w:p>
+      <w:pPr>
+        <w:ind w:left="420" w:hanging="220"/>
+      </w:pPr>
+      <w:r>
+        <w:t xml:space="preserve">•  </w:t>
+      </w:r>
+      <w:r>
+        <w:rPr>
+          <w:rFonts w:ascii="Consolas" w:hAnsi="Consolas" w:cs="Consolas"/>
+        </w:rPr>
+        <w:t xml:space="preserve">users/{uid}</w:t>
+      </w:r>
+      <w:r>
+        <w:t xml:space="preserve"> documents are writable by the owner (name only) and by admins (roles).</w:t>
+      </w:r>
+    </w:p>
+    <w:p>
+      <w:pPr>
+        <w:ind w:left="420" w:hanging="220"/>
+      </w:pPr>
+      <w:r>
+        <w:t xml:space="preserve">•  </w:t>
+      </w:r>
+      <w:r>
+        <w:t xml:space="preserve">The </w:t>
+      </w:r>
+      <w:r>
+        <w:rPr>
+          <w:rFonts w:ascii="Consolas" w:hAnsi="Consolas" w:cs="Consolas"/>
+        </w:rPr>
+        <w:t xml:space="preserve">meta/bootstrap</w:t>
+      </w:r>
+      <w:r>
+        <w:t xml:space="preserve"> marker ensures the first admin account is created exactly once.</w:t>
+      </w:r>
+    </w:p>
+    <w:p>
+      <w:pPr>
+        <w:pStyle w:val="Heading2"/>
+      </w:pPr>
+      <w:r>
+        <w:t xml:space="preserve">9.2 Storage Rules</w:t>
+      </w:r>
+    </w:p>
+    <w:p>
+      <w:r>
+        <w:rPr>
+          <w:rFonts w:ascii="Consolas" w:hAnsi="Consolas" w:cs="Consolas"/>
+        </w:rPr>
+        <w:t xml:space="preserve">firebase/storage.rules</w:t>
+      </w:r>
+      <w:r>
+        <w:t xml:space="preserve"> restrict uploads to </w:t>
+      </w:r>
+      <w:r>
+        <w:rPr>
+          <w:rFonts w:ascii="Consolas" w:hAnsi="Consolas" w:cs="Consolas"/>
+        </w:rPr>
+        <w:t xml:space="preserve">submission-photos/</w:t>
+      </w:r>
+      <w:r>
+        <w:t xml:space="preserve"> paths; signed-in users write under their own </w:t>
+      </w:r>
+      <w:r>
+        <w:rPr>
+          <w:rFonts w:ascii="Consolas" w:hAnsi="Consolas" w:cs="Consolas"/>
+        </w:rPr>
+        <w:t xml:space="preserve">uid</w:t>
+      </w:r>
+      <w:r>
+        <w:t xml:space="preserve"> folder while anonymous visitors write under </w:t>
+      </w:r>
+      <w:r>
+        <w:rPr>
+          <w:rFonts w:ascii="Consolas" w:hAnsi="Consolas" w:cs="Consolas"/>
+        </w:rPr>
+        <w:t xml:space="preserve">guest/</w:t>
+      </w:r>
+      <w:r>
+        <w:t xml:space="preserve">. Files are validated as images client-side (type and ≤ 8 MB) before upload.</w:t>
+      </w:r>
+    </w:p>
+    <w:p>
+      <w:pPr>
+        <w:pStyle w:val="Heading2"/>
+      </w:pPr>
+      <w:r>
+        <w:t xml:space="preserve">9.3 Data Privacy</w:t>
+      </w:r>
+    </w:p>
+    <w:p>
+      <w:r>
+        <w:t xml:space="preserve">Student personal data — student IDs, phone numbers, photos, application details — is never exposed publicly. Only the club's staff can read submissions and complaints for their club.</w:t>
+      </w:r>
+    </w:p>
+    <w:p>
+      <w:pPr>
+        <w:pStyle w:val="Heading2"/>
+      </w:pPr>
+      <w:r>
+        <w:t xml:space="preserve">9.4 Platform Notes</w:t>
+      </w:r>
+    </w:p>
+    <w:p>
+      <w:pPr>
+        <w:ind w:left="420" w:hanging="220"/>
+      </w:pPr>
+      <w:r>
+        <w:t xml:space="preserve">•  </w:t>
+      </w:r>
+      <w:r>
+        <w:t xml:space="preserve">Passwords are handled entirely by Firebase Auth — they are never stored or logged in the application.</w:t>
+      </w:r>
+    </w:p>
+    <w:p>
+      <w:pPr>
+        <w:ind w:left="420" w:hanging="220"/>
+      </w:pPr>
+      <w:r>
+        <w:t xml:space="preserve">•  </w:t>
+      </w:r>
+      <w:r>
+        <w:t xml:space="preserve">Role checks are re-verified from the user's Firestore profile on every restricted read, so revoking a role takes effect immediately.</w:t>
+      </w:r>
+    </w:p>
+    <w:p>
+      <w:pPr>
+        <w:ind w:left="420" w:hanging="220"/>
+      </w:pPr>
+      <w:r>
+        <w:t xml:space="preserve">•  </w:t>
+      </w:r>
+      <w:r>
+        <w:t xml:space="preserve">The Appwrite variant (if used) keeps server-side API keys in </w:t>
+      </w:r>
+      <w:r>
+        <w:rPr>
+          <w:rFonts w:ascii="Consolas" w:hAnsi="Consolas" w:cs="Consolas"/>
+        </w:rPr>
+        <w:t xml:space="preserve">.env</w:t>
+      </w:r>
+      <w:r>
+        <w:t xml:space="preserve"> (gitignored) and enforces roles in the backend; the web app's </w:t>
+      </w:r>
+      <w:r>
+        <w:rPr>
+          <w:rFonts w:ascii="Consolas" w:hAnsi="Consolas" w:cs="Consolas"/>
+        </w:rPr>
+        <w:t xml:space="preserve">/api</w:t>
+      </w:r>
+      <w:r>
+        <w:t xml:space="preserve"> routes use those keys server-side only, so they never reach the browser.</w:t>
+      </w:r>
+    </w:p>
+    <w:p>
+      <w:pPr>
+        <w:pStyle w:val="Heading1"/>
+      </w:pPr>
+      <w:r>
+        <w:t xml:space="preserve">10. Project Structure</w:t>
+      </w:r>
+    </w:p>
+    <w:tbl>
+      <w:tblPr>
+        <w:tblW w:w="9026" w:type="dxa"/>
+        <w:tblBorders>
+          <w:top w:val="single" w:sz="4" w:color="D9DEE8"/>
+          <w:left w:val="single" w:sz="4" w:color="D9DEE8"/>
+          <w:bottom w:val="single" w:sz="4" w:color="D9DEE8"/>
+          <w:right w:val="single" w:sz="4" w:color="D9DEE8"/>
+          <w:insideH w:val="none"/>
+          <w:insideV w:val="none"/>
+        </w:tblBorders>
+        <w:tblCellMar>
+          <w:top w:w="80" w:type="dxa"/>
+          <w:left w:w="160" w:type="dxa"/>
+          <w:bottom w:w="80" w:type="dxa"/>
+          <w:right w:w="160" w:type="dxa"/>
+        </w:tblCellMar>
+      </w:tblPr>
+      <w:tblGrid>
+        <w:gridCol w:w="9026"/>
+      </w:tblGrid>
+      <w:tr>
+        <w:tc>
+          <w:tcPr>
+            <w:tcW w:w="9026" w:type="dxa"/>
+            <w:shd w:val="clear" w:color="auto" w:fill="F5F7FB"/>
+          </w:tcPr>
           <w:p>
             <w:pPr>
               <w:pStyle w:val="Code"/>
               <w:spacing w:after="0" w:line="240" w:lineRule="auto"/>
             </w:pPr>
             <w:r>
-              <w:t xml:space="preserve">├── document/               # PRD, TRD, user flow, application flow, design system</w:t>
+              <w:t xml:space="preserve">NITER-CLUB-WEBSITE/</w:t>
             </w:r>
           </w:p>
           <w:p>
@@ -6162,7 +7539,7 @@
               <w:spacing w:after="0" w:line="240" w:lineRule="auto"/>
             </w:pPr>
             <w:r>
-              <w:t xml:space="preserve">├── firebase/               # Firestore rules, storage rules, hosting config</w:t>
+              <w:t xml:space="preserve">├── index.html              # Legacy static SPA (Firebase + optional Appwrite mirroring)</w:t>
             </w:r>
           </w:p>
           <w:p>
@@ -6171,7 +7548,7 @@
               <w:spacing w:after="0" w:line="240" w:lineRule="auto"/>
             </w:pPr>
             <w:r>
-              <w:t xml:space="preserve">│   ├── firestore.rules</w:t>
+              <w:t xml:space="preserve">├── css/styles.css          # Legacy stylesheet</w:t>
             </w:r>
           </w:p>
           <w:p>
@@ -6180,7 +7557,7 @@
               <w:spacing w:after="0" w:line="240" w:lineRule="auto"/>
             </w:pPr>
             <w:r>
-              <w:t xml:space="preserve">│   ├── storage.rules</w:t>
+              <w:t xml:space="preserve">├── campus/                 # Campus photography used by the web app hero</w:t>
             </w:r>
           </w:p>
           <w:p>
@@ -6189,7 +7566,7 @@
               <w:spacing w:after="0" w:line="240" w:lineRule="auto"/>
             </w:pPr>
             <w:r>
-              <w:t xml:space="preserve">│   ├── firebase.json</w:t>
+              <w:t xml:space="preserve">├── committee/              # Committee portrait photos (local copies)</w:t>
             </w:r>
           </w:p>
           <w:p>
@@ -6198,7 +7575,7 @@
               <w:spacing w:after="0" w:line="240" w:lineRule="auto"/>
             </w:pPr>
             <w:r>
-              <w:t xml:space="preserve">│   └── README.md</w:t>
+              <w:t xml:space="preserve">├── document/               # PRD, TRD, user flow, application flow, design system</w:t>
             </w:r>
           </w:p>
           <w:p>
@@ -6207,7 +7584,7 @@
               <w:spacing w:after="0" w:line="240" w:lineRule="auto"/>
             </w:pPr>
             <w:r>
-              <w:t xml:space="preserve">├── appwrite/               # Alternative backend: provisioning script + MCP configs</w:t>
+              <w:t xml:space="preserve">├── plan/                   # Implementation plan &amp; working notes</w:t>
             </w:r>
           </w:p>
           <w:p>
@@ -6216,7 +7593,7 @@
               <w:spacing w:after="0" w:line="240" w:lineRule="auto"/>
             </w:pPr>
             <w:r>
-              <w:t xml:space="preserve">│   ├── setup-appwrite.mjs</w:t>
+              <w:t xml:space="preserve">├── firebase/               # Firestore rules, storage rules, hosting config</w:t>
             </w:r>
           </w:p>
           <w:p>
@@ -6225,7 +7602,7 @@
               <w:spacing w:after="0" w:line="240" w:lineRule="auto"/>
             </w:pPr>
             <w:r>
-              <w:t xml:space="preserve">│   ├── verify-appwrite.mjs</w:t>
+              <w:t xml:space="preserve">│   ├── firestore.rules</w:t>
             </w:r>
           </w:p>
           <w:p>
@@ -6234,7 +7611,7 @@
               <w:spacing w:after="0" w:line="240" w:lineRule="auto"/>
             </w:pPr>
             <w:r>
-              <w:t xml:space="preserve">│   ├── mcp.json / mcp.cloud.json</w:t>
+              <w:t xml:space="preserve">│   ├── storage.rules</w:t>
             </w:r>
           </w:p>
           <w:p>
@@ -6243,7 +7620,7 @@
               <w:spacing w:after="0" w:line="240" w:lineRule="auto"/>
             </w:pPr>
             <w:r>
-              <w:t xml:space="preserve">│   └── README.md</w:t>
+              <w:t xml:space="preserve">│   ├── firebase.json</w:t>
             </w:r>
           </w:p>
           <w:p>
@@ -6252,7 +7629,7 @@
               <w:spacing w:after="0" w:line="240" w:lineRule="auto"/>
             </w:pPr>
             <w:r>
-              <w:t xml:space="preserve">├── web/                    # Next.js 15 rewrite (recommended for new work)</w:t>
+              <w:t xml:space="preserve">│   └── README.md</w:t>
             </w:r>
           </w:p>
           <w:p>
@@ -6261,7 +7638,7 @@
               <w:spacing w:after="0" w:line="240" w:lineRule="auto"/>
             </w:pPr>
             <w:r>
-              <w:t xml:space="preserve">│   ├── app/                # Routes (home, notices, clubs, portal, it-support, it-desk, …)</w:t>
+              <w:t xml:space="preserve">├── appwrite/               # Alternative backend: setup + seed scripts + MCP configs</w:t>
             </w:r>
           </w:p>
           <w:p>
@@ -6270,7 +7647,7 @@
               <w:spacing w:after="0" w:line="240" w:lineRule="auto"/>
             </w:pPr>
             <w:r>
-              <w:t xml:space="preserve">│   ├── components/         # layout, cards, countdown, views/…</w:t>
+              <w:t xml:space="preserve">│   ├── setup-appwrite.mjs</w:t>
             </w:r>
           </w:p>
           <w:p>
@@ -6279,7 +7656,79 @@
               <w:spacing w:after="0" w:line="240" w:lineRule="auto"/>
             </w:pPr>
             <w:r>
-              <w:t xml:space="preserve">│   ├── lib/                # types, seed, store, firebase, auth, utils</w:t>
+              <w:t xml:space="preserve">│   ├── verify-appwrite.mjs</w:t>
+            </w:r>
+          </w:p>
+          <w:p>
+            <w:pPr>
+              <w:pStyle w:val="Code"/>
+              <w:spacing w:after="0" w:line="240" w:lineRule="auto"/>
+            </w:pPr>
+            <w:r>
+              <w:t xml:space="preserve">│   ├── seed-students.mjs</w:t>
+            </w:r>
+          </w:p>
+          <w:p>
+            <w:pPr>
+              <w:pStyle w:val="Code"/>
+              <w:spacing w:after="0" w:line="240" w:lineRule="auto"/>
+            </w:pPr>
+            <w:r>
+              <w:t xml:space="preserve">│   ├── seed-site-data.mjs</w:t>
+            </w:r>
+          </w:p>
+          <w:p>
+            <w:pPr>
+              <w:pStyle w:val="Code"/>
+              <w:spacing w:after="0" w:line="240" w:lineRule="auto"/>
+            </w:pPr>
+            <w:r>
+              <w:t xml:space="preserve">│   ├── mcp.json / mcp.cloud.json</w:t>
+            </w:r>
+          </w:p>
+          <w:p>
+            <w:pPr>
+              <w:pStyle w:val="Code"/>
+              <w:spacing w:after="0" w:line="240" w:lineRule="auto"/>
+            </w:pPr>
+            <w:r>
+              <w:t xml:space="preserve">│   └── README.md</w:t>
+            </w:r>
+          </w:p>
+          <w:p>
+            <w:pPr>
+              <w:pStyle w:val="Code"/>
+              <w:spacing w:after="0" w:line="240" w:lineRule="auto"/>
+            </w:pPr>
+            <w:r>
+              <w:t xml:space="preserve">├── web/                    # Next.js 15 rewrite (recommended for new work)</w:t>
+            </w:r>
+          </w:p>
+          <w:p>
+            <w:pPr>
+              <w:pStyle w:val="Code"/>
+              <w:spacing w:after="0" w:line="240" w:lineRule="auto"/>
+            </w:pPr>
+            <w:r>
+              <w:t xml:space="preserve">│   ├── app/                # Routes + /api (students, submissions, users, committee-notify)</w:t>
+            </w:r>
+          </w:p>
+          <w:p>
+            <w:pPr>
+              <w:pStyle w:val="Code"/>
+              <w:spacing w:after="0" w:line="240" w:lineRule="auto"/>
+            </w:pPr>
+            <w:r>
+              <w:t xml:space="preserve">│   ├── components/         # layout, cards, ads carousel, countdown, views/…</w:t>
+            </w:r>
+          </w:p>
+          <w:p>
+            <w:pPr>
+              <w:pStyle w:val="Code"/>
+              <w:spacing w:after="0" w:line="240" w:lineRule="auto"/>
+            </w:pPr>
+            <w:r>
+              <w:t xml:space="preserve">│   ├── lib/                # types, seed, store, firebase, auth, utils, appwrite-*</w:t>
             </w:r>
           </w:p>
           <w:p>
@@ -6847,7 +8296,16 @@
               <w:spacing w:after="0" w:line="260" w:lineRule="auto"/>
             </w:pPr>
             <w:r>
-              <w:t xml:space="preserve">Email notifications for application status, event reminders and complaint replies.</w:t>
+              <w:t xml:space="preserve">Email notifications for application status, event reminders and complaint replies (committee-edit emails already shipped via </w:t>
+            </w:r>
+            <w:r>
+              <w:rPr>
+                <w:rFonts w:ascii="Consolas" w:hAnsi="Consolas" w:cs="Consolas"/>
+              </w:rPr>
+              <w:t xml:space="preserve">/api/committee-notify</w:t>
+            </w:r>
+            <w:r>
+              <w:t xml:space="preserve">).</w:t>
             </w:r>
           </w:p>
         </w:tc>
@@ -7280,6 +8738,82 @@
               <w:spacing w:after="0" w:line="260" w:lineRule="auto"/>
             </w:pPr>
             <w:r>
+              <w:t xml:space="preserve">Ad media storage path</w:t>
+            </w:r>
+          </w:p>
+        </w:tc>
+        <w:tc>
+          <w:tcPr>
+            <w:tcW w:w="4513" w:type="dxa"/>
+            <w:shd w:val="clear" w:color="auto" w:fill="FFFFFF"/>
+            <w:vAlign w:val="center"/>
+          </w:tcPr>
+          <w:p>
+            <w:pPr>
+              <w:spacing w:after="0" w:line="260" w:lineRule="auto"/>
+            </w:pPr>
+            <w:r>
+              <w:rPr>
+                <w:rFonts w:ascii="Consolas" w:hAnsi="Consolas" w:cs="Consolas"/>
+              </w:rPr>
+              <w:t xml:space="preserve">ad-media/{clubId}/</w:t>
+            </w:r>
+            <w:r>
+              <w:t xml:space="preserve"> (Firebase Storage)</w:t>
+            </w:r>
+          </w:p>
+        </w:tc>
+      </w:tr>
+      <w:tr>
+        <w:tc>
+          <w:tcPr>
+            <w:tcW w:w="4513" w:type="dxa"/>
+            <w:shd w:val="clear" w:color="auto" w:fill="F5F7FB"/>
+            <w:vAlign w:val="center"/>
+          </w:tcPr>
+          <w:p>
+            <w:pPr>
+              <w:spacing w:after="0" w:line="260" w:lineRule="auto"/>
+            </w:pPr>
+            <w:r>
+              <w:t xml:space="preserve">Submission photos path</w:t>
+            </w:r>
+          </w:p>
+        </w:tc>
+        <w:tc>
+          <w:tcPr>
+            <w:tcW w:w="4513" w:type="dxa"/>
+            <w:shd w:val="clear" w:color="auto" w:fill="F5F7FB"/>
+            <w:vAlign w:val="center"/>
+          </w:tcPr>
+          <w:p>
+            <w:pPr>
+              <w:spacing w:after="0" w:line="260" w:lineRule="auto"/>
+            </w:pPr>
+            <w:r>
+              <w:rPr>
+                <w:rFonts w:ascii="Consolas" w:hAnsi="Consolas" w:cs="Consolas"/>
+              </w:rPr>
+              <w:t xml:space="preserve">submission-photos/</w:t>
+            </w:r>
+            <w:r>
+              <w:t xml:space="preserve"> (Firebase Storage)</w:t>
+            </w:r>
+          </w:p>
+        </w:tc>
+      </w:tr>
+      <w:tr>
+        <w:tc>
+          <w:tcPr>
+            <w:tcW w:w="4513" w:type="dxa"/>
+            <w:shd w:val="clear" w:color="auto" w:fill="FFFFFF"/>
+            <w:vAlign w:val="center"/>
+          </w:tcPr>
+          <w:p>
+            <w:pPr>
+              <w:spacing w:after="0" w:line="260" w:lineRule="auto"/>
+            </w:pPr>
+            <w:r>
               <w:t xml:space="preserve">Next.js dev server</w:t>
             </w:r>
           </w:p>
@@ -7312,6 +8846,62 @@
               <w:spacing w:after="0" w:line="260" w:lineRule="auto"/>
             </w:pPr>
             <w:r>
+              <w:t xml:space="preserve">Appwrite env vars</w:t>
+            </w:r>
+          </w:p>
+        </w:tc>
+        <w:tc>
+          <w:tcPr>
+            <w:tcW w:w="4513" w:type="dxa"/>
+            <w:shd w:val="clear" w:color="auto" w:fill="F5F7FB"/>
+            <w:vAlign w:val="center"/>
+          </w:tcPr>
+          <w:p>
+            <w:pPr>
+              <w:spacing w:after="0" w:line="260" w:lineRule="auto"/>
+            </w:pPr>
+            <w:r>
+              <w:rPr>
+                <w:rFonts w:ascii="Consolas" w:hAnsi="Consolas" w:cs="Consolas"/>
+              </w:rPr>
+              <w:t xml:space="preserve">APPWRITE_ENDPOINT</w:t>
+            </w:r>
+            <w:r>
+              <w:t xml:space="preserve">, </w:t>
+            </w:r>
+            <w:r>
+              <w:rPr>
+                <w:rFonts w:ascii="Consolas" w:hAnsi="Consolas" w:cs="Consolas"/>
+              </w:rPr>
+              <w:t xml:space="preserve">APPWRITE_PROJECT_ID</w:t>
+            </w:r>
+            <w:r>
+              <w:t xml:space="preserve">, </w:t>
+            </w:r>
+            <w:r>
+              <w:rPr>
+                <w:rFonts w:ascii="Consolas" w:hAnsi="Consolas" w:cs="Consolas"/>
+              </w:rPr>
+              <w:t xml:space="preserve">APPWRITE_API_KEY</w:t>
+            </w:r>
+            <w:r>
+              <w:t xml:space="preserve"> (web/.env.local)</w:t>
+            </w:r>
+          </w:p>
+        </w:tc>
+      </w:tr>
+      <w:tr>
+        <w:tc>
+          <w:tcPr>
+            <w:tcW w:w="4513" w:type="dxa"/>
+            <w:shd w:val="clear" w:color="auto" w:fill="FFFFFF"/>
+            <w:vAlign w:val="center"/>
+          </w:tcPr>
+          <w:p>
+            <w:pPr>
+              <w:spacing w:after="0" w:line="260" w:lineRule="auto"/>
+            </w:pPr>
+            <w:r>
               <w:t xml:space="preserve">Primary documentation</w:t>
             </w:r>
           </w:p>
@@ -7319,7 +8909,7 @@
         <w:tc>
           <w:tcPr>
             <w:tcW w:w="4513" w:type="dxa"/>
-            <w:shd w:val="clear" w:color="auto" w:fill="F5F7FB"/>
+            <w:shd w:val="clear" w:color="auto" w:fill="FFFFFF"/>
             <w:vAlign w:val="center"/>
           </w:tcPr>
           <w:p>
@@ -7951,7 +9541,7 @@
         <w:sz w:val="16"/>
         <w:szCs w:val="16"/>
       </w:rPr>
-      <w:t>NITER Clubs Portal — Project Documentation v1.0</w:t>
+      <w:t>NITER Clubs Portal — Project Documentation v2.0</w:t>
     </w:r>
   </w:p>
 </w:hdr>

</xml_diff>

<commit_message>
Update documentation.docx to v4.0 with NeuroNest credit and logo
Adds Chapter 14 (math engine, document intelligence, campus knowledge),
bumps the title version to 4.0, adds the v4.0 revision-history row, credits
the Neuro Nest team on the title page, and embeds the NeuroNest logo.

🤖 Generated with Codebuff
Co-Authored-By: Codebuff <noreply@codebuff.com>
</commit_message>
<xml_diff>
--- a/documentation.docx
+++ b/documentation.docx
@@ -108,7 +108,7 @@
         <w:t>Version:</w:t>
       </w:r>
       <w:r>
-        <w:t>  3.0</w:t>
+        <w:t>  4.0</w:t>
       </w:r>
     </w:p>
     <w:p>
@@ -157,6 +157,66 @@
       </w:r>
       <w:r>
         <w:t>  github.com/ashrafularefin78-prog/NITER-CLUB-WEBSITE</w:t>
+      </w:r>
+    </w:p>
+    <w:p>
+      <w:pPr>
+        <w:spacing w:after="40"/>
+        <w:jc w:val="center"/>
+      </w:pPr>
+      <w:r>
+        <w:rPr>
+          <w:b/>
+          <w:color w:val="002147"/>
+        </w:rPr>
+        <w:t>Developed by:</w:t>
+      </w:r>
+      <w:r>
+        <w:t xml:space="preserve"> Neuro Nest</w:t>
+      </w:r>
+    </w:p>
+    <w:p>
+      <w:pPr>
+        <w:spacing w:before="160" w:after="0"/>
+        <w:jc w:val="center"/>
+      </w:pPr>
+      <w:r>
+        <w:rPr>
+          <w:noProof/>
+        </w:rPr>
+        <w:drawing>
+          <wp:inline distT="0" distB="0" distL="0" distR="0" wp14:anchorId="C4E9A102" wp14:editId="65F69728">
+            <wp:extent cx="2000000" cy="2000000"/>
+            <wp:effectExtent l="0" t="0" r="0" b="0"/>
+            <wp:docPr id="2" name="NeuroNest Logo"/>
+            <wp:cNvGraphicFramePr/>
+            <a:graphic xmlns:a="http://schemas.openxmlformats.org/drawingml/2006/main">
+              <a:graphicData uri="http://schemas.openxmlformats.org/drawingml/2006/picture">
+                <pic:pic xmlns:pic="http://schemas.openxmlformats.org/drawingml/2006/picture">
+                  <pic:nvPicPr>
+                    <pic:cNvPr id="1" name="neuornest-logo.jpg"/>
+                    <pic:cNvPicPr/>
+                  </pic:nvPicPr>
+                  <pic:blipFill>
+                    <a:blip r:embed="rId5"/>
+                    <a:stretch>
+                      <a:fillRect/>
+                    </a:stretch>
+                  </pic:blipFill>
+                  <pic:spPr>
+                    <a:xfrm>
+                      <a:off x="0" y="0"/>
+                      <a:ext cx="2000000" cy="2000000"/>
+                    </a:xfrm>
+                    <a:prstGeom prst="rect">
+                      <a:avLst/>
+                    </a:prstGeom>
+                  </pic:spPr>
+                </pic:pic>
+              </a:graphicData>
+            </a:graphic>
+          </wp:inline>
+        </w:drawing>
       </w:r>
     </w:p>
     <w:p>
@@ -598,45 +658,55 @@
         <w:tc>
           <w:tcPr>
             <w:tcW w:w="3009" w:type="dxa"/>
-            <w:shd w:val="clear" w:color="auto" w:fill="FFFFFF"/>
-            <w:vAlign w:val="center"/>
-          </w:tcPr>
-          <w:p>
-            <w:pPr>
-              <w:spacing w:after="0" w:line="260" w:lineRule="auto"/>
-            </w:pPr>
-            <w:r>
-              <w:t>1.0</w:t>
+            <w:shd w:val="clear" w:color="auto" w:fill="FFF7E6"/>
+            <w:vAlign w:val="center"/>
+          </w:tcPr>
+          <w:p>
+            <w:pPr>
+              <w:spacing w:after="0" w:line="260" w:lineRule="auto"/>
+            </w:pPr>
+            <w:r>
+              <w:rPr>
+                <w:b/>
+                <w:color w:val="B45309"/>
+              </w:rPr>
+              <w:t>4.0</w:t>
             </w:r>
           </w:p>
         </w:tc>
         <w:tc>
           <w:tcPr>
             <w:tcW w:w="3009" w:type="dxa"/>
-            <w:shd w:val="clear" w:color="auto" w:fill="FFFFFF"/>
-            <w:vAlign w:val="center"/>
-          </w:tcPr>
-          <w:p>
-            <w:pPr>
-              <w:spacing w:after="0" w:line="260" w:lineRule="auto"/>
-            </w:pPr>
-            <w:r>
-              <w:t>10 Aug 2026</w:t>
+            <w:shd w:val="clear" w:color="auto" w:fill="FFF7E6"/>
+            <w:vAlign w:val="center"/>
+          </w:tcPr>
+          <w:p>
+            <w:pPr>
+              <w:spacing w:after="0" w:line="260" w:lineRule="auto"/>
+            </w:pPr>
+            <w:r>
+              <w:t>August 16, 2026</w:t>
             </w:r>
           </w:p>
         </w:tc>
         <w:tc>
           <w:tcPr>
             <w:tcW w:w="3009" w:type="dxa"/>
-            <w:shd w:val="clear" w:color="auto" w:fill="FFFFFF"/>
-            <w:vAlign w:val="center"/>
-          </w:tcPr>
-          <w:p>
-            <w:pPr>
-              <w:spacing w:after="0" w:line="260" w:lineRule="auto"/>
-            </w:pPr>
-            <w:r>
-              <w:t>Initial release.</w:t>
+            <w:shd w:val="clear" w:color="auto" w:fill="FFF7E6"/>
+            <w:vAlign w:val="center"/>
+          </w:tcPr>
+          <w:p>
+            <w:pPr>
+              <w:spacing w:after="0" w:line="260" w:lineRule="auto"/>
+            </w:pPr>
+            <w:r>
+              <w:t xml:space="preserve">Added Chapter 14 </w:t>
+            </w:r>
+            <w:r>
+              <w:t>ai</w:t>
+            </w:r>
+            <w:r>
+              <w:t>” math engine, document intelligence &amp; campus knowledge; project developed by the Neuro Nest team.</w:t>
             </w:r>
           </w:p>
         </w:tc>
@@ -648,6 +718,56 @@
         <w:tc>
           <w:tcPr>
             <w:tcW w:w="3009" w:type="dxa"/>
+            <w:shd w:val="clear" w:color="auto" w:fill="FFFFFF"/>
+            <w:vAlign w:val="center"/>
+          </w:tcPr>
+          <w:p>
+            <w:pPr>
+              <w:spacing w:after="0" w:line="260" w:lineRule="auto"/>
+            </w:pPr>
+            <w:r>
+              <w:t>1.0</w:t>
+            </w:r>
+          </w:p>
+        </w:tc>
+        <w:tc>
+          <w:tcPr>
+            <w:tcW w:w="3009" w:type="dxa"/>
+            <w:shd w:val="clear" w:color="auto" w:fill="FFFFFF"/>
+            <w:vAlign w:val="center"/>
+          </w:tcPr>
+          <w:p>
+            <w:pPr>
+              <w:spacing w:after="0" w:line="260" w:lineRule="auto"/>
+            </w:pPr>
+            <w:r>
+              <w:t>10 Aug 2026</w:t>
+            </w:r>
+          </w:p>
+        </w:tc>
+        <w:tc>
+          <w:tcPr>
+            <w:tcW w:w="3009" w:type="dxa"/>
+            <w:shd w:val="clear" w:color="auto" w:fill="FFFFFF"/>
+            <w:vAlign w:val="center"/>
+          </w:tcPr>
+          <w:p>
+            <w:pPr>
+              <w:spacing w:after="0" w:line="260" w:lineRule="auto"/>
+            </w:pPr>
+            <w:r>
+              <w:t>Initial release.</w:t>
+            </w:r>
+          </w:p>
+        </w:tc>
+      </w:tr>
+      <w:tr>
+        <w:trPr>
+          <w:jc w:val="center"/>
+        </w:trPr>
+        <w:tc>
+          <w:tcPr>
+            <w:tcW w:w="3009" w:type="dxa"/>
             <w:shd w:val="clear" w:color="auto" w:fill="F5F7FB"/>
             <w:vAlign w:val="center"/>
           </w:tcPr>
@@ -754,6 +874,7 @@
         <w:ind w:left="420" w:hanging="220"/>
       </w:pPr>
       <w:r>
+        <w:lastRenderedPageBreak/>
         <w:t>•  </w:t>
       </w:r>
       <w:r>
@@ -846,7 +967,6 @@
         <w:ind w:left="420" w:hanging="220"/>
       </w:pPr>
       <w:r>
-        <w:lastRenderedPageBreak/>
         <w:t>•  </w:t>
       </w:r>
       <w:r>
@@ -16200,12 +16320,298 @@
       <w:pPr>
         <w:pStyle w:val="Heading1"/>
       </w:pPr>
-      <w:bookmarkStart w:id="69" w:name="_Toc237808737"/>
+      <w:bookmarkStart w:id="69" w:name="_Toc237808740"/>
       <w:r>
         <w:lastRenderedPageBreak/>
+        <w:t>14. v4.0: Math Engine, Document Intelligence &amp; Campus Knowledge</w:t>
+      </w:r>
+      <w:bookmarkEnd w:id="69"/>
+    </w:p>
+    <w:p>
+      <w:r>
+        <w:t>Version 4.0 extends NITER AI with three new capability areas: a full offline math engine, an attach-and-read document pipeline with industry-grade OCR, and expanded official-source campus knowledge with live, time-aware answers. Everything is processed locally in the browser - nothing you upload ever leaves your machine.</w:t>
+      </w:r>
+    </w:p>
+    <w:p>
+      <w:pPr>
+        <w:pStyle w:val="Heading2"/>
+      </w:pPr>
+      <w:bookmarkStart w:id="70" w:name="_Toc237808741"/>
+      <w:r>
+        <w:t>14.1 NITER AI Math Engine</w:t>
+      </w:r>
+      <w:bookmarkEnd w:id="70"/>
+    </w:p>
+    <w:p>
+      <w:r>
+        <w:t>NITER AI can now solve mathematics directly in the chat, fully offline, before the code vault or knowledge base runs. Answers render as styled cards with step-by-step rules, a .docx export button and the "How I reasoned" panel; shortcuts live in the LIVE NOW rail.</w:t>
+      </w:r>
+    </w:p>
+    <w:p>
+      <w:pPr>
+        <w:ind w:left="420" w:hanging="220"/>
+      </w:pPr>
+      <w:r>
+        <w:rPr>
+          <w:b/>
+          <w:color w:val="002147"/>
+        </w:rPr>
+        <w:t>•</w:t>
+      </w:r>
+      <w:r>
+        <w:t>Equations: linear ("solve 2x+3=7") and quadratic ("x²-5x+6=0") with the discriminant shown.</w:t>
+      </w:r>
+    </w:p>
+    <w:p>
+      <w:pPr>
+        <w:ind w:left="420" w:hanging="220"/>
+      </w:pPr>
+      <w:r>
+        <w:rPr>
+          <w:b/>
+          <w:color w:val="002147"/>
+        </w:rPr>
+        <w:t>•</w:t>
+      </w:r>
+      <w:r>
+        <w:t>Calculus: derivatives ("differentiate x^3") and indefinite integrals ("integrate 2x dx") with the power rule and antiderivative steps.</w:t>
+      </w:r>
+    </w:p>
+    <w:p>
+      <w:pPr>
+        <w:ind w:left="420" w:hanging="220"/>
+      </w:pPr>
+      <w:r>
+        <w:rPr>
+          <w:b/>
+          <w:color w:val="002147"/>
+        </w:rPr>
+        <w:t>•</w:t>
+      </w:r>
+      <w:r>
+        <w:t>Percentages: of, increase/decrease and "what percent of 200 is 50".</w:t>
+      </w:r>
+    </w:p>
+    <w:p>
+      <w:pPr>
+        <w:ind w:left="420" w:hanging="220"/>
+      </w:pPr>
+      <w:r>
+        <w:rPr>
+          <w:b/>
+          <w:color w:val="002147"/>
+        </w:rPr>
+        <w:t>•</w:t>
+      </w:r>
+      <w:r>
+        <w:t>Number theory: factorials, primality, GCD/LCM, prime factors, mean/range/standard deviation.</w:t>
+      </w:r>
+    </w:p>
+    <w:p>
+      <w:pPr>
+        <w:ind w:left="420" w:hanging="220"/>
+      </w:pPr>
+      <w:r>
+        <w:rPr>
+          <w:b/>
+          <w:color w:val="002147"/>
+        </w:rPr>
+        <w:t>•</w:t>
+      </w:r>
+      <w:r>
+        <w:t>Geometry and trigonometry: circle area/circumference, Pythagoras, exact sin/cos/tan values.</w:t>
+      </w:r>
+    </w:p>
+    <w:p>
+      <w:pPr>
+        <w:ind w:left="420" w:hanging="220"/>
+      </w:pPr>
+      <w:r>
+        <w:rPr>
+          <w:b/>
+          <w:color w:val="002147"/>
+        </w:rPr>
+        <w:t>•</w:t>
+      </w:r>
+      <w:r>
+        <w:t>Unit conversions: km↔miles, kg↔lbs, °C↔°F, hours↔minutes and more, plus expression evaluation at a point and function calls (log, ln, sqrt, cbrt).</w:t>
+      </w:r>
+    </w:p>
+    <w:p>
+      <w:pPr>
+        <w:pStyle w:val="Heading2"/>
+      </w:pPr>
+      <w:bookmarkStart w:id="71" w:name="_Toc237808742"/>
+      <w:r>
+        <w:t>14.2 Attach &amp; Read Documents (OCR &amp; Parsing)</w:t>
+      </w:r>
+      <w:bookmarkEnd w:id="71"/>
+    </w:p>
+    <w:p>
+      <w:r>
+        <w:t>NITER AI accepts attachments through the 📎 button or drag-and-drop in both the floating window and the full-page view. Uploaded files become a session document the assistant can understand and answer questions about.</w:t>
+      </w:r>
+    </w:p>
+    <w:p>
+      <w:pPr>
+        <w:ind w:left="420" w:hanging="220"/>
+      </w:pPr>
+      <w:r>
+        <w:rPr>
+          <w:b/>
+          <w:color w:val="002147"/>
+        </w:rPr>
+        <w:t>•</w:t>
+      </w:r>
+      <w:r>
+        <w:t>Images → OCR with Tesseract.js (the standard client OCR engine); PDFs → text-layer extraction with pdf.js; .docx → a hand-rolled ZIP + native DecompressionStream parser (no libraries, fully offline); .txt/.md/.csv/.json read directly.</w:t>
+      </w:r>
+    </w:p>
+    <w:p>
+      <w:pPr>
+        <w:ind w:left="420" w:hanging="220"/>
+      </w:pPr>
+      <w:r>
+        <w:rPr>
+          <w:b/>
+          <w:color w:val="002147"/>
+        </w:rPr>
+        <w:t>•</w:t>
+      </w:r>
+      <w:r>
+        <w:t>Document understanding: extractive summaries, data mining (emails, phone numbers, names, dates, URLs), word/page/character stats, and a rough Bangla translation of the opening.</w:t>
+      </w:r>
+    </w:p>
+    <w:p>
+      <w:pPr>
+        <w:ind w:left="420" w:hanging="220"/>
+      </w:pPr>
+      <w:r>
+        <w:rPr>
+          <w:b/>
+          <w:color w:val="002147"/>
+        </w:rPr>
+        <w:t>•</w:t>
+      </w:r>
+      <w:r>
+        <w:t>File cards in chat show a thumbnail, page/character counts and a collapsible extracted-text viewer; the document persists across reloads and clears with the chat.</w:t>
+      </w:r>
+    </w:p>
+    <w:p>
+      <w:pPr>
+        <w:ind w:left="420" w:hanging="220"/>
+      </w:pPr>
+      <w:r>
+        <w:rPr>
+          <w:b/>
+          <w:color w:val="002147"/>
+        </w:rPr>
+        <w:t>•</w:t>
+      </w:r>
+      <w:r>
+        <w:t>Privacy: all processing is in-browser; OCR/PDF engines lazy-load from CDN only on first use and degrade gracefully when offline.</w:t>
+      </w:r>
+    </w:p>
+    <w:p>
+      <w:pPr>
+        <w:pStyle w:val="Heading2"/>
+      </w:pPr>
+      <w:bookmarkStart w:id="72" w:name="_Toc237808743"/>
+      <w:r>
+        <w:t>14.3 Live Campus Knowledge from Official Sources</w:t>
+      </w:r>
+      <w:bookmarkEnd w:id="72"/>
+    </w:p>
+    <w:p>
+      <w:r>
+        <w:t>Deep, official-source entries for the everyday facilities students actually ask about, plus a live time-aware status for the library.</w:t>
+      </w:r>
+    </w:p>
+    <w:p>
+      <w:pPr>
+        <w:ind w:left="420" w:hanging="220"/>
+      </w:pPr>
+      <w:r>
+        <w:rPr>
+          <w:b/>
+          <w:color w:val="002147"/>
+        </w:rPr>
+        <w:lastRenderedPageBreak/>
+        <w:t>•</w:t>
+      </w:r>
+      <w:r>
+        <w:t>Library: the full official profile (17,000+/19,000+ books, air-conditioned, borrowing/reading/group/reference/photocopy services) plus "is the library open right now?" computed from the current time (Sun–Thu, 8:00 AM–4:00 PM) - day-aware for "on Friday" and "tomorrow".</w:t>
+      </w:r>
+    </w:p>
+    <w:p>
+      <w:pPr>
+        <w:ind w:left="420" w:hanging="220"/>
+      </w:pPr>
+      <w:r>
+        <w:rPr>
+          <w:b/>
+          <w:color w:val="002147"/>
+        </w:rPr>
+        <w:t>•</w:t>
+      </w:r>
+      <w:r>
+        <w:t>Library etiquette &amp; rules: quiet reading room, ID-based borrowing, per-day late fines and what is not allowed.</w:t>
+      </w:r>
+    </w:p>
+    <w:p>
+      <w:pPr>
+        <w:ind w:left="420" w:hanging="220"/>
+      </w:pPr>
+      <w:r>
+        <w:rPr>
+          <w:b/>
+          <w:color w:val="002147"/>
+        </w:rPr>
+        <w:t>•</w:t>
+      </w:r>
+      <w:r>
+        <w:t>Medical centre: 1st floor of Academic Building-2 (Room AC-216), a Residential Medical Officer, and corporate agreements with Enam Medical College Hospital and The IBN SINA TRUST.</w:t>
+      </w:r>
+    </w:p>
+    <w:p>
+      <w:pPr>
+        <w:ind w:left="420" w:hanging="220"/>
+      </w:pPr>
+      <w:r>
+        <w:rPr>
+          <w:b/>
+          <w:color w:val="002147"/>
+        </w:rPr>
+        <w:t>•</w:t>
+      </w:r>
+      <w:r>
+        <w:t>Hostels: boys' (~400 seats) and girls' (~300 seats) hostels with the official fees (৳2,500 refundable security + ৳550/month) and the campus canteen with its hostel dining rooms.</w:t>
+      </w:r>
+    </w:p>
+    <w:p>
+      <w:pPr>
+        <w:pStyle w:val="Heading2"/>
+      </w:pPr>
+      <w:bookmarkStart w:id="73" w:name="_Toc237808744"/>
+      <w:r>
+        <w:t>14.4 Credits</w:t>
+      </w:r>
+      <w:bookmarkEnd w:id="73"/>
+    </w:p>
+    <w:p>
+      <w:r>
+        <w:t>The NITER Clubs Portal is made and developed by the Neuro Nest team.</w:t>
+      </w:r>
+    </w:p>
+    <w:p>
+      <w:pPr>
+        <w:pStyle w:val="Heading1"/>
+      </w:pPr>
+      <w:bookmarkStart w:id="74" w:name="_Toc237808737"/>
+      <w:r>
         <w:t>Appendix A — Reference</w:t>
       </w:r>
-      <w:bookmarkEnd w:id="69"/>
+      <w:bookmarkEnd w:id="74"/>
     </w:p>
     <w:tbl>
       <w:tblPr>
@@ -16660,11 +17066,11 @@
       <w:pPr>
         <w:pStyle w:val="Heading2"/>
       </w:pPr>
-      <w:bookmarkStart w:id="70" w:name="_Toc237808738"/>
+      <w:bookmarkStart w:id="75" w:name="_Toc237808738"/>
       <w:r>
         <w:t>Key Commands</w:t>
       </w:r>
-      <w:bookmarkEnd w:id="70"/>
+      <w:bookmarkEnd w:id="75"/>
     </w:p>
     <w:tbl>
       <w:tblPr>
@@ -16779,11 +17185,11 @@
       <w:pPr>
         <w:pStyle w:val="Heading1"/>
       </w:pPr>
-      <w:bookmarkStart w:id="71" w:name="_Toc237808739"/>
+      <w:bookmarkStart w:id="76" w:name="_Toc237808739"/>
       <w:r>
         <w:t>Appendix B — Glossary</w:t>
       </w:r>
-      <w:bookmarkEnd w:id="71"/>
+      <w:bookmarkEnd w:id="76"/>
     </w:p>
     <w:tbl>
       <w:tblPr>
@@ -16977,7 +17383,6 @@
               <w:spacing w:after="0" w:line="260" w:lineRule="auto"/>
             </w:pPr>
             <w:r>
-              <w:lastRenderedPageBreak/>
               <w:t>SPA</w:t>
             </w:r>
           </w:p>

</xml_diff>